<commit_message>
Add detailed descriptions of engineered features for repayment behavior, bill amounts, payment amounts, and financial ratios
</commit_message>
<xml_diff>
--- a/doc/DatasetDescription.docx
+++ b/doc/DatasetDescription.docx
@@ -40,27 +40,7 @@
             <w:sz w:val="36"/>
             <w:szCs w:val="36"/>
           </w:rPr>
-          <w:t xml:space="preserve">Default of credit </w:t>
-        </w:r>
-        <w:r>
-          <w:rPr>
-            <w:rStyle w:val="Hyperlink"/>
-            <w:b/>
-            <w:bCs/>
-            <w:sz w:val="36"/>
-            <w:szCs w:val="36"/>
-          </w:rPr>
-          <w:t>c</w:t>
-        </w:r>
-        <w:r>
-          <w:rPr>
-            <w:rStyle w:val="Hyperlink"/>
-            <w:b/>
-            <w:bCs/>
-            <w:sz w:val="36"/>
-            <w:szCs w:val="36"/>
-          </w:rPr>
-          <w:t>ard clients</w:t>
+          <w:t>Default of credit card clients</w:t>
         </w:r>
       </w:hyperlink>
     </w:p>
@@ -223,6 +203,1030 @@
       <w:proofErr w:type="gramEnd"/>
       <w:r>
         <w:t xml:space="preserve">23 = amount paid in April, 2005. </w:t>
+      </w:r>
+    </w:p>
+    <w:p/>
+    <w:p/>
+    <w:p>
+      <w:pPr>
+        <w:pStyle w:val="Heading1"/>
+        <w:rPr>
+          <w:b/>
+          <w:bCs/>
+          <w:color w:val="FFFFFF" w:themeColor="background1"/>
+        </w:rPr>
+      </w:pPr>
+      <w:r>
+        <w:rPr>
+          <w:b/>
+          <w:bCs/>
+          <w:color w:val="FFFFFF" w:themeColor="background1"/>
+        </w:rPr>
+        <w:lastRenderedPageBreak/>
+        <w:t>Engineered Features Description</w:t>
+      </w:r>
+    </w:p>
+    <w:p>
+      <w:pPr>
+        <w:pStyle w:val="Heading2"/>
+        <w:rPr>
+          <w:b/>
+          <w:bCs/>
+          <w:color w:val="FFFFFF" w:themeColor="background1"/>
+        </w:rPr>
+      </w:pPr>
+      <w:r>
+        <w:rPr>
+          <w:b/>
+          <w:bCs/>
+          <w:color w:val="FFFFFF" w:themeColor="background1"/>
+        </w:rPr>
+        <w:t>1. Repayment Behavior Features</w:t>
+      </w:r>
+    </w:p>
+    <w:p>
+      <w:proofErr w:type="spellStart"/>
+      <w:r>
+        <w:rPr>
+          <w:b/>
+          <w:bCs/>
+        </w:rPr>
+        <w:t>Avg_Repayment_Status</w:t>
+      </w:r>
+      <w:proofErr w:type="spellEnd"/>
+    </w:p>
+    <w:p>
+      <w:pPr>
+        <w:numPr>
+          <w:ilvl w:val="0"/>
+          <w:numId w:val="2"/>
+        </w:numPr>
+      </w:pPr>
+      <w:r>
+        <w:rPr>
+          <w:b/>
+          <w:bCs/>
+        </w:rPr>
+        <w:t>Meaning:</w:t>
+      </w:r>
+      <w:r>
+        <w:t> Average repayment delay status over 6 months (April to September)</w:t>
+      </w:r>
+    </w:p>
+    <w:p>
+      <w:pPr>
+        <w:numPr>
+          <w:ilvl w:val="0"/>
+          <w:numId w:val="2"/>
+        </w:numPr>
+      </w:pPr>
+      <w:r>
+        <w:rPr>
+          <w:b/>
+          <w:bCs/>
+        </w:rPr>
+        <w:t>Calculation:</w:t>
+      </w:r>
+      <w:r>
+        <w:t xml:space="preserve"> Mean of the </w:t>
+      </w:r>
+      <w:proofErr w:type="gramStart"/>
+      <w:r>
+        <w:t>six monthly</w:t>
+      </w:r>
+      <w:proofErr w:type="gramEnd"/>
+      <w:r>
+        <w:t xml:space="preserve"> repayment status columns (</w:t>
+      </w:r>
+      <w:proofErr w:type="spellStart"/>
+      <w:r>
+        <w:t>RPay_stat_apr</w:t>
+      </w:r>
+      <w:proofErr w:type="spellEnd"/>
+      <w:r>
+        <w:t> through </w:t>
+      </w:r>
+      <w:proofErr w:type="spellStart"/>
+      <w:r>
+        <w:t>RPay_stat_sep</w:t>
+      </w:r>
+      <w:proofErr w:type="spellEnd"/>
+      <w:r>
+        <w:t>)</w:t>
+      </w:r>
+    </w:p>
+    <w:p>
+      <w:pPr>
+        <w:numPr>
+          <w:ilvl w:val="0"/>
+          <w:numId w:val="2"/>
+        </w:numPr>
+      </w:pPr>
+      <w:r>
+        <w:rPr>
+          <w:b/>
+          <w:bCs/>
+        </w:rPr>
+        <w:t>Why this approach:</w:t>
+      </w:r>
+      <w:r>
+        <w:t> The mean provides a single summary of overall payment discipline and is sensitive to extreme delays, which helps identify chronic delinquency patterns.</w:t>
+      </w:r>
+    </w:p>
+    <w:p>
+      <w:proofErr w:type="spellStart"/>
+      <w:r>
+        <w:rPr>
+          <w:b/>
+          <w:bCs/>
+        </w:rPr>
+        <w:t>Max_Repayment_Status</w:t>
+      </w:r>
+      <w:proofErr w:type="spellEnd"/>
+    </w:p>
+    <w:p>
+      <w:pPr>
+        <w:numPr>
+          <w:ilvl w:val="0"/>
+          <w:numId w:val="3"/>
+        </w:numPr>
+      </w:pPr>
+      <w:r>
+        <w:rPr>
+          <w:b/>
+          <w:bCs/>
+        </w:rPr>
+        <w:t>Meaning:</w:t>
+      </w:r>
+      <w:r>
+        <w:t> Worst (maximum) repayment delay status over the same 6-month period</w:t>
+      </w:r>
+    </w:p>
+    <w:p>
+      <w:pPr>
+        <w:numPr>
+          <w:ilvl w:val="0"/>
+          <w:numId w:val="3"/>
+        </w:numPr>
+      </w:pPr>
+      <w:r>
+        <w:rPr>
+          <w:b/>
+          <w:bCs/>
+        </w:rPr>
+        <w:t>Calculation:</w:t>
+      </w:r>
+      <w:r>
+        <w:t xml:space="preserve"> Maximum value across the </w:t>
+      </w:r>
+      <w:proofErr w:type="gramStart"/>
+      <w:r>
+        <w:t>six monthly</w:t>
+      </w:r>
+      <w:proofErr w:type="gramEnd"/>
+      <w:r>
+        <w:t xml:space="preserve"> repayment status columns</w:t>
+      </w:r>
+    </w:p>
+    <w:p>
+      <w:pPr>
+        <w:numPr>
+          <w:ilvl w:val="0"/>
+          <w:numId w:val="3"/>
+        </w:numPr>
+      </w:pPr>
+      <w:r>
+        <w:rPr>
+          <w:b/>
+          <w:bCs/>
+        </w:rPr>
+        <w:t>Why this approach:</w:t>
+      </w:r>
+      <w:r>
+        <w:t> Captures peak delinquency—a single severe delay can signal future default even if other months show timely payments.</w:t>
+      </w:r>
+    </w:p>
+    <w:p>
+      <w:proofErr w:type="spellStart"/>
+      <w:r>
+        <w:rPr>
+          <w:b/>
+          <w:bCs/>
+        </w:rPr>
+        <w:t>Delayed_Months_Count</w:t>
+      </w:r>
+      <w:proofErr w:type="spellEnd"/>
+    </w:p>
+    <w:p>
+      <w:pPr>
+        <w:numPr>
+          <w:ilvl w:val="0"/>
+          <w:numId w:val="4"/>
+        </w:numPr>
+      </w:pPr>
+      <w:r>
+        <w:rPr>
+          <w:b/>
+          <w:bCs/>
+        </w:rPr>
+        <w:t>Meaning:</w:t>
+      </w:r>
+      <w:r>
+        <w:t> Number of months where repayment was delayed</w:t>
+      </w:r>
+    </w:p>
+    <w:p>
+      <w:pPr>
+        <w:numPr>
+          <w:ilvl w:val="0"/>
+          <w:numId w:val="4"/>
+        </w:numPr>
+      </w:pPr>
+      <w:r>
+        <w:rPr>
+          <w:b/>
+          <w:bCs/>
+        </w:rPr>
+        <w:t>Calculation:</w:t>
+      </w:r>
+      <w:r>
+        <w:t> Count of months where repayment status &gt; 0 (positive values indicate delay)</w:t>
+      </w:r>
+    </w:p>
+    <w:p>
+      <w:pPr>
+        <w:numPr>
+          <w:ilvl w:val="0"/>
+          <w:numId w:val="4"/>
+        </w:numPr>
+      </w:pPr>
+      <w:r>
+        <w:rPr>
+          <w:b/>
+          <w:bCs/>
+        </w:rPr>
+        <w:t>Why this approach:</w:t>
+      </w:r>
+      <w:r>
+        <w:t> Measures the frequency of late payments, which is a strong and intuitive predictor of default behavior.</w:t>
+      </w:r>
+    </w:p>
+    <w:p>
+      <w:r>
+        <w:rPr>
+          <w:b/>
+          <w:bCs/>
+        </w:rPr>
+        <w:t>Repayment status values:</w:t>
+      </w:r>
+      <w:r>
+        <w:t> -2 to -1 indicate early/on-time payment, 0 means 1 month delay, 1 means 2 months delay, up to 8 meaning 9+ months delay.</w:t>
+      </w:r>
+    </w:p>
+    <w:p>
+      <w:r>
+        <w:pict w14:anchorId="6F0CD249">
+          <v:rect id="_x0000_i1097" style="width:0;height:.75pt" o:hralign="center" o:hrstd="t" o:hr="t" fillcolor="#a0a0a0" stroked="f"/>
+        </w:pict>
+      </w:r>
+    </w:p>
+    <w:p>
+      <w:pPr>
+        <w:rPr>
+          <w:b/>
+          <w:bCs/>
+        </w:rPr>
+      </w:pPr>
+    </w:p>
+    <w:p>
+      <w:pPr>
+        <w:rPr>
+          <w:b/>
+          <w:bCs/>
+        </w:rPr>
+      </w:pPr>
+    </w:p>
+    <w:p>
+      <w:pPr>
+        <w:rPr>
+          <w:b/>
+          <w:bCs/>
+        </w:rPr>
+      </w:pPr>
+    </w:p>
+    <w:p>
+      <w:pPr>
+        <w:rPr>
+          <w:b/>
+          <w:bCs/>
+        </w:rPr>
+      </w:pPr>
+    </w:p>
+    <w:p>
+      <w:pPr>
+        <w:rPr>
+          <w:b/>
+          <w:bCs/>
+        </w:rPr>
+      </w:pPr>
+    </w:p>
+    <w:p>
+      <w:pPr>
+        <w:pStyle w:val="Heading2"/>
+        <w:rPr>
+          <w:b/>
+          <w:bCs/>
+          <w:color w:val="FFFFFF" w:themeColor="background1"/>
+        </w:rPr>
+      </w:pPr>
+      <w:r>
+        <w:rPr>
+          <w:b/>
+          <w:bCs/>
+          <w:color w:val="FFFFFF" w:themeColor="background1"/>
+        </w:rPr>
+        <w:lastRenderedPageBreak/>
+        <w:t>2. Bill Amount Features</w:t>
+      </w:r>
+    </w:p>
+    <w:p>
+      <w:proofErr w:type="spellStart"/>
+      <w:r>
+        <w:rPr>
+          <w:b/>
+          <w:bCs/>
+        </w:rPr>
+        <w:t>Med_Bill_Amount</w:t>
+      </w:r>
+      <w:proofErr w:type="spellEnd"/>
+    </w:p>
+    <w:p>
+      <w:pPr>
+        <w:numPr>
+          <w:ilvl w:val="0"/>
+          <w:numId w:val="5"/>
+        </w:numPr>
+      </w:pPr>
+      <w:r>
+        <w:rPr>
+          <w:b/>
+          <w:bCs/>
+        </w:rPr>
+        <w:t>Meaning:</w:t>
+      </w:r>
+      <w:r>
+        <w:t> Typical monthly bill amount for the customer</w:t>
+      </w:r>
+    </w:p>
+    <w:p>
+      <w:pPr>
+        <w:numPr>
+          <w:ilvl w:val="0"/>
+          <w:numId w:val="5"/>
+        </w:numPr>
+      </w:pPr>
+      <w:r>
+        <w:rPr>
+          <w:b/>
+          <w:bCs/>
+        </w:rPr>
+        <w:t>Calculation:</w:t>
+      </w:r>
+      <w:r>
+        <w:t xml:space="preserve"> Median of the </w:t>
+      </w:r>
+      <w:proofErr w:type="gramStart"/>
+      <w:r>
+        <w:t>six monthly</w:t>
+      </w:r>
+      <w:proofErr w:type="gramEnd"/>
+      <w:r>
+        <w:t xml:space="preserve"> bill amounts (</w:t>
+      </w:r>
+      <w:proofErr w:type="spellStart"/>
+      <w:r>
+        <w:t>Bill_amt_apr</w:t>
+      </w:r>
+      <w:proofErr w:type="spellEnd"/>
+      <w:r>
+        <w:t> through </w:t>
+      </w:r>
+      <w:proofErr w:type="spellStart"/>
+      <w:r>
+        <w:t>Bill_amt_sep</w:t>
+      </w:r>
+      <w:proofErr w:type="spellEnd"/>
+      <w:r>
+        <w:t>)</w:t>
+      </w:r>
+    </w:p>
+    <w:p>
+      <w:pPr>
+        <w:numPr>
+          <w:ilvl w:val="0"/>
+          <w:numId w:val="5"/>
+        </w:numPr>
+      </w:pPr>
+      <w:r>
+        <w:rPr>
+          <w:b/>
+          <w:bCs/>
+        </w:rPr>
+        <w:t>Why this approach:</w:t>
+      </w:r>
+      <w:r>
+        <w:t> Median is used instead of mean because bill amounts can have extreme spikes (e.g., large one-time purchases). The median is robust to outliers and better represents the customer's "normal" spending level.</w:t>
+      </w:r>
+    </w:p>
+    <w:p>
+      <w:proofErr w:type="spellStart"/>
+      <w:r>
+        <w:rPr>
+          <w:b/>
+          <w:bCs/>
+        </w:rPr>
+        <w:t>Total_Bill_Amount</w:t>
+      </w:r>
+      <w:proofErr w:type="spellEnd"/>
+    </w:p>
+    <w:p>
+      <w:pPr>
+        <w:numPr>
+          <w:ilvl w:val="0"/>
+          <w:numId w:val="6"/>
+        </w:numPr>
+      </w:pPr>
+      <w:r>
+        <w:rPr>
+          <w:b/>
+          <w:bCs/>
+        </w:rPr>
+        <w:t>Meaning:</w:t>
+      </w:r>
+      <w:r>
+        <w:t> Total financial obligation over the 6-month period</w:t>
+      </w:r>
+    </w:p>
+    <w:p>
+      <w:pPr>
+        <w:numPr>
+          <w:ilvl w:val="0"/>
+          <w:numId w:val="6"/>
+        </w:numPr>
+      </w:pPr>
+      <w:r>
+        <w:rPr>
+          <w:b/>
+          <w:bCs/>
+        </w:rPr>
+        <w:t>Calculation:</w:t>
+      </w:r>
+      <w:r>
+        <w:t xml:space="preserve"> Sum of all </w:t>
+      </w:r>
+      <w:proofErr w:type="gramStart"/>
+      <w:r>
+        <w:t>six monthly</w:t>
+      </w:r>
+      <w:proofErr w:type="gramEnd"/>
+      <w:r>
+        <w:t xml:space="preserve"> bill amounts</w:t>
+      </w:r>
+    </w:p>
+    <w:p>
+      <w:pPr>
+        <w:numPr>
+          <w:ilvl w:val="0"/>
+          <w:numId w:val="6"/>
+        </w:numPr>
+      </w:pPr>
+      <w:r>
+        <w:rPr>
+          <w:b/>
+          <w:bCs/>
+        </w:rPr>
+        <w:t>Why this approach:</w:t>
+      </w:r>
+      <w:r>
+        <w:t> Captures the overall debt burden, which is essential for understanding the customer's total liability.</w:t>
+      </w:r>
+    </w:p>
+    <w:p>
+      <w:r>
+        <w:pict w14:anchorId="59EC3DF1">
+          <v:rect id="_x0000_i1098" style="width:0;height:.75pt" o:hralign="center" o:hrstd="t" o:hr="t" fillcolor="#a0a0a0" stroked="f"/>
+        </w:pict>
+      </w:r>
+    </w:p>
+    <w:p>
+      <w:pPr>
+        <w:pStyle w:val="Heading2"/>
+        <w:rPr>
+          <w:b/>
+          <w:bCs/>
+          <w:color w:val="FFFFFF" w:themeColor="background1"/>
+        </w:rPr>
+      </w:pPr>
+      <w:r>
+        <w:rPr>
+          <w:b/>
+          <w:bCs/>
+          <w:color w:val="FFFFFF" w:themeColor="background1"/>
+        </w:rPr>
+        <w:t>3. Payment Amount Features</w:t>
+      </w:r>
+    </w:p>
+    <w:p>
+      <w:proofErr w:type="spellStart"/>
+      <w:r>
+        <w:rPr>
+          <w:b/>
+          <w:bCs/>
+        </w:rPr>
+        <w:t>Med_Payment_Amount</w:t>
+      </w:r>
+      <w:proofErr w:type="spellEnd"/>
+    </w:p>
+    <w:p>
+      <w:pPr>
+        <w:numPr>
+          <w:ilvl w:val="0"/>
+          <w:numId w:val="7"/>
+        </w:numPr>
+      </w:pPr>
+      <w:r>
+        <w:rPr>
+          <w:b/>
+          <w:bCs/>
+        </w:rPr>
+        <w:t>Meaning:</w:t>
+      </w:r>
+      <w:r>
+        <w:t> Typical monthly payment made by the customer</w:t>
+      </w:r>
+    </w:p>
+    <w:p>
+      <w:pPr>
+        <w:numPr>
+          <w:ilvl w:val="0"/>
+          <w:numId w:val="7"/>
+        </w:numPr>
+      </w:pPr>
+      <w:r>
+        <w:rPr>
+          <w:b/>
+          <w:bCs/>
+        </w:rPr>
+        <w:t>Calculation:</w:t>
+      </w:r>
+      <w:r>
+        <w:t xml:space="preserve"> Median of the </w:t>
+      </w:r>
+      <w:proofErr w:type="gramStart"/>
+      <w:r>
+        <w:t>six monthly</w:t>
+      </w:r>
+      <w:proofErr w:type="gramEnd"/>
+      <w:r>
+        <w:t xml:space="preserve"> payment amounts (</w:t>
+      </w:r>
+      <w:proofErr w:type="spellStart"/>
+      <w:r>
+        <w:t>Pay_amt_apr</w:t>
+      </w:r>
+      <w:proofErr w:type="spellEnd"/>
+      <w:r>
+        <w:t> through </w:t>
+      </w:r>
+      <w:proofErr w:type="spellStart"/>
+      <w:r>
+        <w:t>Pay_amt_sep</w:t>
+      </w:r>
+      <w:proofErr w:type="spellEnd"/>
+      <w:r>
+        <w:t>)</w:t>
+      </w:r>
+    </w:p>
+    <w:p>
+      <w:pPr>
+        <w:numPr>
+          <w:ilvl w:val="0"/>
+          <w:numId w:val="7"/>
+        </w:numPr>
+      </w:pPr>
+      <w:r>
+        <w:rPr>
+          <w:b/>
+          <w:bCs/>
+        </w:rPr>
+        <w:t>Why this approach:</w:t>
+      </w:r>
+      <w:r>
+        <w:t> Like bills, payment amounts can have outliers (e.g., one large settlement payment followed by small payments). The median reflects consistent payment behavior more accurately than the mean.</w:t>
+      </w:r>
+    </w:p>
+    <w:p>
+      <w:proofErr w:type="spellStart"/>
+      <w:r>
+        <w:rPr>
+          <w:b/>
+          <w:bCs/>
+        </w:rPr>
+        <w:t>Total_Payment_Amount</w:t>
+      </w:r>
+      <w:proofErr w:type="spellEnd"/>
+    </w:p>
+    <w:p>
+      <w:pPr>
+        <w:numPr>
+          <w:ilvl w:val="0"/>
+          <w:numId w:val="8"/>
+        </w:numPr>
+      </w:pPr>
+      <w:r>
+        <w:rPr>
+          <w:b/>
+          <w:bCs/>
+        </w:rPr>
+        <w:t>Meaning:</w:t>
+      </w:r>
+      <w:r>
+        <w:t> Total payments made over 6 months</w:t>
+      </w:r>
+    </w:p>
+    <w:p>
+      <w:pPr>
+        <w:numPr>
+          <w:ilvl w:val="0"/>
+          <w:numId w:val="8"/>
+        </w:numPr>
+      </w:pPr>
+      <w:r>
+        <w:rPr>
+          <w:b/>
+          <w:bCs/>
+        </w:rPr>
+        <w:t>Calculation:</w:t>
+      </w:r>
+      <w:r>
+        <w:t xml:space="preserve"> Sum of all </w:t>
+      </w:r>
+      <w:proofErr w:type="gramStart"/>
+      <w:r>
+        <w:t>six monthly</w:t>
+      </w:r>
+      <w:proofErr w:type="gramEnd"/>
+      <w:r>
+        <w:t xml:space="preserve"> payment amounts</w:t>
+      </w:r>
+    </w:p>
+    <w:p>
+      <w:pPr>
+        <w:numPr>
+          <w:ilvl w:val="0"/>
+          <w:numId w:val="8"/>
+        </w:numPr>
+      </w:pPr>
+      <w:r>
+        <w:rPr>
+          <w:b/>
+          <w:bCs/>
+        </w:rPr>
+        <w:t>Why this approach:</w:t>
+      </w:r>
+      <w:r>
+        <w:t> Measures total money paid; when combined with total bill amount, it reveals the customer's payment capacity and discipline.</w:t>
+      </w:r>
+    </w:p>
+    <w:p>
+      <w:r>
+        <w:pict w14:anchorId="57113777">
+          <v:rect id="_x0000_i1099" style="width:0;height:.75pt" o:hralign="center" o:hrstd="t" o:hr="t" fillcolor="#a0a0a0" stroked="f"/>
+        </w:pict>
+      </w:r>
+    </w:p>
+    <w:p>
+      <w:pPr>
+        <w:pStyle w:val="Heading2"/>
+        <w:rPr>
+          <w:b/>
+          <w:bCs/>
+          <w:color w:val="FFFFFF" w:themeColor="background1"/>
+        </w:rPr>
+      </w:pPr>
+      <w:r>
+        <w:rPr>
+          <w:b/>
+          <w:bCs/>
+          <w:color w:val="FFFFFF" w:themeColor="background1"/>
+        </w:rPr>
+        <w:lastRenderedPageBreak/>
+        <w:t>4. Financial Ratio Features</w:t>
+      </w:r>
+    </w:p>
+    <w:p>
+      <w:proofErr w:type="spellStart"/>
+      <w:r>
+        <w:rPr>
+          <w:b/>
+          <w:bCs/>
+        </w:rPr>
+        <w:t>Payment_Ratio</w:t>
+      </w:r>
+      <w:proofErr w:type="spellEnd"/>
+    </w:p>
+    <w:p>
+      <w:pPr>
+        <w:numPr>
+          <w:ilvl w:val="0"/>
+          <w:numId w:val="9"/>
+        </w:numPr>
+      </w:pPr>
+      <w:r>
+        <w:rPr>
+          <w:b/>
+          <w:bCs/>
+        </w:rPr>
+        <w:t>Meaning:</w:t>
+      </w:r>
+      <w:r>
+        <w:t> Proportion of total bill amount that was actually paid</w:t>
+      </w:r>
+    </w:p>
+    <w:p>
+      <w:pPr>
+        <w:numPr>
+          <w:ilvl w:val="0"/>
+          <w:numId w:val="9"/>
+        </w:numPr>
+      </w:pPr>
+      <w:r>
+        <w:rPr>
+          <w:b/>
+          <w:bCs/>
+        </w:rPr>
+        <w:t>Calculation:</w:t>
+      </w:r>
+      <w:r>
+        <w:t> </w:t>
+      </w:r>
+      <w:proofErr w:type="spellStart"/>
+      <w:r>
+        <w:t>Total_Payment_Amount</w:t>
+      </w:r>
+      <w:proofErr w:type="spellEnd"/>
+      <w:r>
+        <w:t xml:space="preserve"> / (</w:t>
+      </w:r>
+      <w:proofErr w:type="spellStart"/>
+      <w:r>
+        <w:t>Total_Bill_Amount</w:t>
+      </w:r>
+      <w:proofErr w:type="spellEnd"/>
+      <w:r>
+        <w:t xml:space="preserve"> + 1)</w:t>
+      </w:r>
+    </w:p>
+    <w:p>
+      <w:pPr>
+        <w:numPr>
+          <w:ilvl w:val="0"/>
+          <w:numId w:val="9"/>
+        </w:numPr>
+      </w:pPr>
+      <w:r>
+        <w:rPr>
+          <w:b/>
+          <w:bCs/>
+        </w:rPr>
+        <w:t>Why +1 is added:</w:t>
+      </w:r>
+      <w:r>
+        <w:t> The +1 prevents division by zero when </w:t>
+      </w:r>
+      <w:proofErr w:type="spellStart"/>
+      <w:r>
+        <w:t>Total_Bill_Amount</w:t>
+      </w:r>
+      <w:proofErr w:type="spellEnd"/>
+      <w:r>
+        <w:t xml:space="preserve"> = 0 (which can occur if a customer had no bill for the period). This addition has negligible effect on the ratio for normal values but ensures numerical stability and avoids undefined results.</w:t>
+      </w:r>
+    </w:p>
+    <w:p>
+      <w:proofErr w:type="spellStart"/>
+      <w:r>
+        <w:rPr>
+          <w:b/>
+          <w:bCs/>
+        </w:rPr>
+        <w:t>Credit_Utilization_Ratio</w:t>
+      </w:r>
+      <w:proofErr w:type="spellEnd"/>
+    </w:p>
+    <w:p>
+      <w:pPr>
+        <w:numPr>
+          <w:ilvl w:val="0"/>
+          <w:numId w:val="10"/>
+        </w:numPr>
+      </w:pPr>
+      <w:r>
+        <w:rPr>
+          <w:b/>
+          <w:bCs/>
+        </w:rPr>
+        <w:t>Meaning:</w:t>
+      </w:r>
+      <w:r>
+        <w:t> How much of the customer's credit limit was used</w:t>
+      </w:r>
+    </w:p>
+    <w:p>
+      <w:pPr>
+        <w:numPr>
+          <w:ilvl w:val="0"/>
+          <w:numId w:val="10"/>
+        </w:numPr>
+      </w:pPr>
+      <w:r>
+        <w:rPr>
+          <w:b/>
+          <w:bCs/>
+        </w:rPr>
+        <w:t>Calculation:</w:t>
+      </w:r>
+      <w:r>
+        <w:t> </w:t>
+      </w:r>
+      <w:proofErr w:type="spellStart"/>
+      <w:r>
+        <w:t>Total_Bill_Amount</w:t>
+      </w:r>
+      <w:proofErr w:type="spellEnd"/>
+      <w:r>
+        <w:t xml:space="preserve"> / (</w:t>
+      </w:r>
+      <w:proofErr w:type="spellStart"/>
+      <w:r>
+        <w:t>Limit_Bal</w:t>
+      </w:r>
+      <w:proofErr w:type="spellEnd"/>
+      <w:r>
+        <w:t xml:space="preserve"> + 1)</w:t>
+      </w:r>
+    </w:p>
+    <w:p>
+      <w:pPr>
+        <w:numPr>
+          <w:ilvl w:val="0"/>
+          <w:numId w:val="10"/>
+        </w:numPr>
+      </w:pPr>
+      <w:r>
+        <w:rPr>
+          <w:b/>
+          <w:bCs/>
+        </w:rPr>
+        <w:t>Why +1 is added:</w:t>
+      </w:r>
+      <w:r>
+        <w:t> The +1 prevents division by zero when the credit limit is zero (theoretically possible or due to data anomalies). It guarantees the ratio is always computable and stable across all customers.</w:t>
+      </w:r>
+    </w:p>
+    <w:p>
+      <w:r>
+        <w:pict w14:anchorId="4A89C62B">
+          <v:rect id="_x0000_i1100" style="width:0;height:.75pt" o:hralign="center" o:hrstd="t" o:hr="t" fillcolor="#a0a0a0" stroked="f"/>
+        </w:pict>
+      </w:r>
+    </w:p>
+    <w:p>
+      <w:pPr>
+        <w:rPr>
+          <w:b/>
+          <w:bCs/>
+        </w:rPr>
+      </w:pPr>
+      <w:r>
+        <w:rPr>
+          <w:b/>
+          <w:bCs/>
+        </w:rPr>
+        <w:t>Summary of Purpose</w:t>
+      </w:r>
+    </w:p>
+    <w:p>
+      <w:r>
+        <w:t>These engineered features transform raw monthly transaction data into meaningful behavioral and financial summary metrics, achieving dimensionality reduction while preserving — and even enhancing — predictive signals for credit default risk.</w:t>
+      </w:r>
+    </w:p>
+    <w:p>
+      <w:r>
+        <w:rPr>
+          <w:b/>
+          <w:bCs/>
+        </w:rPr>
+        <w:t>What each group captures:</w:t>
+      </w:r>
+    </w:p>
+    <w:p>
+      <w:pPr>
+        <w:numPr>
+          <w:ilvl w:val="0"/>
+          <w:numId w:val="11"/>
+        </w:numPr>
+      </w:pPr>
+      <w:r>
+        <w:rPr>
+          <w:b/>
+          <w:bCs/>
+        </w:rPr>
+        <w:t>Repayment features</w:t>
+      </w:r>
+      <w:r>
+        <w:t> → Payment discipline and delinquency history</w:t>
+      </w:r>
+    </w:p>
+    <w:p>
+      <w:pPr>
+        <w:numPr>
+          <w:ilvl w:val="0"/>
+          <w:numId w:val="11"/>
+        </w:numPr>
+      </w:pPr>
+      <w:r>
+        <w:rPr>
+          <w:b/>
+          <w:bCs/>
+        </w:rPr>
+        <w:t>Bill aggregates</w:t>
+      </w:r>
+      <w:r>
+        <w:t> → Spending patterns and financial obligations</w:t>
+      </w:r>
+    </w:p>
+    <w:p>
+      <w:pPr>
+        <w:numPr>
+          <w:ilvl w:val="0"/>
+          <w:numId w:val="11"/>
+        </w:numPr>
+      </w:pPr>
+      <w:r>
+        <w:rPr>
+          <w:b/>
+          <w:bCs/>
+        </w:rPr>
+        <w:t>Payment aggregates</w:t>
+      </w:r>
+      <w:r>
+        <w:t> → Payment capacity and consistency</w:t>
+      </w:r>
+    </w:p>
+    <w:p>
+      <w:pPr>
+        <w:numPr>
+          <w:ilvl w:val="0"/>
+          <w:numId w:val="11"/>
+        </w:numPr>
+      </w:pPr>
+      <w:r>
+        <w:rPr>
+          <w:b/>
+          <w:bCs/>
+        </w:rPr>
+        <w:t>Financial ratios</w:t>
+      </w:r>
+      <w:r>
+        <w:t> → Financial stress indicators (high utilization combined with low payment ratio strongly suggests elevated default risk)</w:t>
+      </w:r>
+    </w:p>
+    <w:p>
+      <w:r>
+        <w:rPr>
+          <w:b/>
+          <w:bCs/>
+        </w:rPr>
+        <w:t>Key design principles applied:</w:t>
+      </w:r>
+    </w:p>
+    <w:p>
+      <w:pPr>
+        <w:numPr>
+          <w:ilvl w:val="0"/>
+          <w:numId w:val="12"/>
+        </w:numPr>
+      </w:pPr>
+      <w:r>
+        <w:rPr>
+          <w:b/>
+          <w:bCs/>
+        </w:rPr>
+        <w:t>Median is used</w:t>
+      </w:r>
+      <w:r>
+        <w:t> for individual monthly values to resist outliers and represent "typical" customer behavior</w:t>
       </w:r>
     </w:p>
     <w:p/>
@@ -291,6 +1295,1198 @@
 <file path=word/numbering.xml><?xml version="1.0" encoding="utf-8"?>
 <w:numbering xmlns:wpc="http://schemas.microsoft.com/office/word/2010/wordprocessingCanvas" xmlns:cx="http://schemas.microsoft.com/office/drawing/2014/chartex" xmlns:cx1="http://schemas.microsoft.com/office/drawing/2015/9/8/chartex" xmlns:cx2="http://schemas.microsoft.com/office/drawing/2015/10/21/chartex" xmlns:cx3="http://schemas.microsoft.com/office/drawing/2016/5/9/chartex" xmlns:cx4="http://schemas.microsoft.com/office/drawing/2016/5/10/chartex" xmlns:cx5="http://schemas.microsoft.com/office/drawing/2016/5/11/chartex" xmlns:cx6="http://schemas.microsoft.com/office/drawing/2016/5/12/chartex" xmlns:cx7="http://schemas.microsoft.com/office/drawing/2016/5/13/chartex" xmlns:cx8="http://schemas.microsoft.com/office/drawing/2016/5/14/chartex" xmlns:mc="http://schemas.openxmlformats.org/markup-compatibility/2006" xmlns:aink="http://schemas.microsoft.com/office/drawing/2016/ink" xmlns:am3d="http://schemas.microsoft.com/office/drawing/2017/model3d" xmlns:o="urn:schemas-microsoft-com:office:office" xmlns:oel="http://schemas.microsoft.com/office/2019/extlst" xmlns:r="http://schemas.openxmlformats.org/officeDocument/2006/relationships" xmlns:m="http://schemas.openxmlformats.org/officeDocument/2006/math" xmlns:v="urn:schemas-microsoft-com:vml" xmlns:wp14="http://schemas.microsoft.com/office/word/2010/wordprocessingDrawing" xmlns:wp="http://schemas.openxmlformats.org/drawingml/2006/wordprocessingDrawing" xmlns:w10="urn:schemas-microsoft-com:office:word" xmlns:w="http://schemas.openxmlformats.org/wordprocessingml/2006/main" xmlns:w14="http://schemas.microsoft.com/office/word/2010/wordml" xmlns:w15="http://schemas.microsoft.com/office/word/2012/wordml" xmlns:w16cex="http://schemas.microsoft.com/office/word/2018/wordml/cex" xmlns:w16cid="http://schemas.microsoft.com/office/word/2016/wordml/cid" xmlns:w16="http://schemas.microsoft.com/office/word/2018/wordml" xmlns:w16sdtdh="http://schemas.microsoft.com/office/word/2020/wordml/sdtdatahash" xmlns:w16se="http://schemas.microsoft.com/office/word/2015/wordml/symex" xmlns:wpg="http://schemas.microsoft.com/office/word/2010/wordprocessingGroup" xmlns:wpi="http://schemas.microsoft.com/office/word/2010/wordprocessingInk" xmlns:wne="http://schemas.microsoft.com/office/word/2006/wordml" xmlns:wps="http://schemas.microsoft.com/office/word/2010/wordprocessingShape" mc:Ignorable="w14 w15 w16se w16cid w16 w16cex w16sdtdh wp14">
   <w:abstractNum w:abstractNumId="0" w15:restartNumberingAfterBreak="0">
+    <w:nsid w:val="195D35F8"/>
+    <w:multiLevelType w:val="multilevel"/>
+    <w:tmpl w:val="380ED830"/>
+    <w:lvl w:ilvl="0">
+      <w:start w:val="1"/>
+      <w:numFmt w:val="bullet"/>
+      <w:lvlText w:val=""/>
+      <w:lvlJc w:val="left"/>
+      <w:pPr>
+        <w:tabs>
+          <w:tab w:val="num" w:pos="720"/>
+        </w:tabs>
+        <w:ind w:left="720" w:hanging="360"/>
+      </w:pPr>
+      <w:rPr>
+        <w:rFonts w:ascii="Symbol" w:hAnsi="Symbol" w:hint="default"/>
+        <w:sz w:val="20"/>
+      </w:rPr>
+    </w:lvl>
+    <w:lvl w:ilvl="1" w:tentative="1">
+      <w:start w:val="1"/>
+      <w:numFmt w:val="bullet"/>
+      <w:lvlText w:val="o"/>
+      <w:lvlJc w:val="left"/>
+      <w:pPr>
+        <w:tabs>
+          <w:tab w:val="num" w:pos="1440"/>
+        </w:tabs>
+        <w:ind w:left="1440" w:hanging="360"/>
+      </w:pPr>
+      <w:rPr>
+        <w:rFonts w:ascii="Courier New" w:hAnsi="Courier New" w:hint="default"/>
+        <w:sz w:val="20"/>
+      </w:rPr>
+    </w:lvl>
+    <w:lvl w:ilvl="2" w:tentative="1">
+      <w:start w:val="1"/>
+      <w:numFmt w:val="bullet"/>
+      <w:lvlText w:val=""/>
+      <w:lvlJc w:val="left"/>
+      <w:pPr>
+        <w:tabs>
+          <w:tab w:val="num" w:pos="2160"/>
+        </w:tabs>
+        <w:ind w:left="2160" w:hanging="360"/>
+      </w:pPr>
+      <w:rPr>
+        <w:rFonts w:ascii="Wingdings" w:hAnsi="Wingdings" w:hint="default"/>
+        <w:sz w:val="20"/>
+      </w:rPr>
+    </w:lvl>
+    <w:lvl w:ilvl="3" w:tentative="1">
+      <w:start w:val="1"/>
+      <w:numFmt w:val="bullet"/>
+      <w:lvlText w:val=""/>
+      <w:lvlJc w:val="left"/>
+      <w:pPr>
+        <w:tabs>
+          <w:tab w:val="num" w:pos="2880"/>
+        </w:tabs>
+        <w:ind w:left="2880" w:hanging="360"/>
+      </w:pPr>
+      <w:rPr>
+        <w:rFonts w:ascii="Wingdings" w:hAnsi="Wingdings" w:hint="default"/>
+        <w:sz w:val="20"/>
+      </w:rPr>
+    </w:lvl>
+    <w:lvl w:ilvl="4" w:tentative="1">
+      <w:start w:val="1"/>
+      <w:numFmt w:val="bullet"/>
+      <w:lvlText w:val=""/>
+      <w:lvlJc w:val="left"/>
+      <w:pPr>
+        <w:tabs>
+          <w:tab w:val="num" w:pos="3600"/>
+        </w:tabs>
+        <w:ind w:left="3600" w:hanging="360"/>
+      </w:pPr>
+      <w:rPr>
+        <w:rFonts w:ascii="Wingdings" w:hAnsi="Wingdings" w:hint="default"/>
+        <w:sz w:val="20"/>
+      </w:rPr>
+    </w:lvl>
+    <w:lvl w:ilvl="5" w:tentative="1">
+      <w:start w:val="1"/>
+      <w:numFmt w:val="bullet"/>
+      <w:lvlText w:val=""/>
+      <w:lvlJc w:val="left"/>
+      <w:pPr>
+        <w:tabs>
+          <w:tab w:val="num" w:pos="4320"/>
+        </w:tabs>
+        <w:ind w:left="4320" w:hanging="360"/>
+      </w:pPr>
+      <w:rPr>
+        <w:rFonts w:ascii="Wingdings" w:hAnsi="Wingdings" w:hint="default"/>
+        <w:sz w:val="20"/>
+      </w:rPr>
+    </w:lvl>
+    <w:lvl w:ilvl="6" w:tentative="1">
+      <w:start w:val="1"/>
+      <w:numFmt w:val="bullet"/>
+      <w:lvlText w:val=""/>
+      <w:lvlJc w:val="left"/>
+      <w:pPr>
+        <w:tabs>
+          <w:tab w:val="num" w:pos="5040"/>
+        </w:tabs>
+        <w:ind w:left="5040" w:hanging="360"/>
+      </w:pPr>
+      <w:rPr>
+        <w:rFonts w:ascii="Wingdings" w:hAnsi="Wingdings" w:hint="default"/>
+        <w:sz w:val="20"/>
+      </w:rPr>
+    </w:lvl>
+    <w:lvl w:ilvl="7" w:tentative="1">
+      <w:start w:val="1"/>
+      <w:numFmt w:val="bullet"/>
+      <w:lvlText w:val=""/>
+      <w:lvlJc w:val="left"/>
+      <w:pPr>
+        <w:tabs>
+          <w:tab w:val="num" w:pos="5760"/>
+        </w:tabs>
+        <w:ind w:left="5760" w:hanging="360"/>
+      </w:pPr>
+      <w:rPr>
+        <w:rFonts w:ascii="Wingdings" w:hAnsi="Wingdings" w:hint="default"/>
+        <w:sz w:val="20"/>
+      </w:rPr>
+    </w:lvl>
+    <w:lvl w:ilvl="8" w:tentative="1">
+      <w:start w:val="1"/>
+      <w:numFmt w:val="bullet"/>
+      <w:lvlText w:val=""/>
+      <w:lvlJc w:val="left"/>
+      <w:pPr>
+        <w:tabs>
+          <w:tab w:val="num" w:pos="6480"/>
+        </w:tabs>
+        <w:ind w:left="6480" w:hanging="360"/>
+      </w:pPr>
+      <w:rPr>
+        <w:rFonts w:ascii="Wingdings" w:hAnsi="Wingdings" w:hint="default"/>
+        <w:sz w:val="20"/>
+      </w:rPr>
+    </w:lvl>
+  </w:abstractNum>
+  <w:abstractNum w:abstractNumId="1" w15:restartNumberingAfterBreak="0">
+    <w:nsid w:val="1A1373B9"/>
+    <w:multiLevelType w:val="multilevel"/>
+    <w:tmpl w:val="C6206C4A"/>
+    <w:lvl w:ilvl="0">
+      <w:start w:val="1"/>
+      <w:numFmt w:val="bullet"/>
+      <w:lvlText w:val=""/>
+      <w:lvlJc w:val="left"/>
+      <w:pPr>
+        <w:tabs>
+          <w:tab w:val="num" w:pos="720"/>
+        </w:tabs>
+        <w:ind w:left="720" w:hanging="360"/>
+      </w:pPr>
+      <w:rPr>
+        <w:rFonts w:ascii="Symbol" w:hAnsi="Symbol" w:hint="default"/>
+        <w:sz w:val="20"/>
+      </w:rPr>
+    </w:lvl>
+    <w:lvl w:ilvl="1" w:tentative="1">
+      <w:start w:val="1"/>
+      <w:numFmt w:val="bullet"/>
+      <w:lvlText w:val="o"/>
+      <w:lvlJc w:val="left"/>
+      <w:pPr>
+        <w:tabs>
+          <w:tab w:val="num" w:pos="1440"/>
+        </w:tabs>
+        <w:ind w:left="1440" w:hanging="360"/>
+      </w:pPr>
+      <w:rPr>
+        <w:rFonts w:ascii="Courier New" w:hAnsi="Courier New" w:hint="default"/>
+        <w:sz w:val="20"/>
+      </w:rPr>
+    </w:lvl>
+    <w:lvl w:ilvl="2" w:tentative="1">
+      <w:start w:val="1"/>
+      <w:numFmt w:val="bullet"/>
+      <w:lvlText w:val=""/>
+      <w:lvlJc w:val="left"/>
+      <w:pPr>
+        <w:tabs>
+          <w:tab w:val="num" w:pos="2160"/>
+        </w:tabs>
+        <w:ind w:left="2160" w:hanging="360"/>
+      </w:pPr>
+      <w:rPr>
+        <w:rFonts w:ascii="Wingdings" w:hAnsi="Wingdings" w:hint="default"/>
+        <w:sz w:val="20"/>
+      </w:rPr>
+    </w:lvl>
+    <w:lvl w:ilvl="3" w:tentative="1">
+      <w:start w:val="1"/>
+      <w:numFmt w:val="bullet"/>
+      <w:lvlText w:val=""/>
+      <w:lvlJc w:val="left"/>
+      <w:pPr>
+        <w:tabs>
+          <w:tab w:val="num" w:pos="2880"/>
+        </w:tabs>
+        <w:ind w:left="2880" w:hanging="360"/>
+      </w:pPr>
+      <w:rPr>
+        <w:rFonts w:ascii="Wingdings" w:hAnsi="Wingdings" w:hint="default"/>
+        <w:sz w:val="20"/>
+      </w:rPr>
+    </w:lvl>
+    <w:lvl w:ilvl="4" w:tentative="1">
+      <w:start w:val="1"/>
+      <w:numFmt w:val="bullet"/>
+      <w:lvlText w:val=""/>
+      <w:lvlJc w:val="left"/>
+      <w:pPr>
+        <w:tabs>
+          <w:tab w:val="num" w:pos="3600"/>
+        </w:tabs>
+        <w:ind w:left="3600" w:hanging="360"/>
+      </w:pPr>
+      <w:rPr>
+        <w:rFonts w:ascii="Wingdings" w:hAnsi="Wingdings" w:hint="default"/>
+        <w:sz w:val="20"/>
+      </w:rPr>
+    </w:lvl>
+    <w:lvl w:ilvl="5" w:tentative="1">
+      <w:start w:val="1"/>
+      <w:numFmt w:val="bullet"/>
+      <w:lvlText w:val=""/>
+      <w:lvlJc w:val="left"/>
+      <w:pPr>
+        <w:tabs>
+          <w:tab w:val="num" w:pos="4320"/>
+        </w:tabs>
+        <w:ind w:left="4320" w:hanging="360"/>
+      </w:pPr>
+      <w:rPr>
+        <w:rFonts w:ascii="Wingdings" w:hAnsi="Wingdings" w:hint="default"/>
+        <w:sz w:val="20"/>
+      </w:rPr>
+    </w:lvl>
+    <w:lvl w:ilvl="6" w:tentative="1">
+      <w:start w:val="1"/>
+      <w:numFmt w:val="bullet"/>
+      <w:lvlText w:val=""/>
+      <w:lvlJc w:val="left"/>
+      <w:pPr>
+        <w:tabs>
+          <w:tab w:val="num" w:pos="5040"/>
+        </w:tabs>
+        <w:ind w:left="5040" w:hanging="360"/>
+      </w:pPr>
+      <w:rPr>
+        <w:rFonts w:ascii="Wingdings" w:hAnsi="Wingdings" w:hint="default"/>
+        <w:sz w:val="20"/>
+      </w:rPr>
+    </w:lvl>
+    <w:lvl w:ilvl="7" w:tentative="1">
+      <w:start w:val="1"/>
+      <w:numFmt w:val="bullet"/>
+      <w:lvlText w:val=""/>
+      <w:lvlJc w:val="left"/>
+      <w:pPr>
+        <w:tabs>
+          <w:tab w:val="num" w:pos="5760"/>
+        </w:tabs>
+        <w:ind w:left="5760" w:hanging="360"/>
+      </w:pPr>
+      <w:rPr>
+        <w:rFonts w:ascii="Wingdings" w:hAnsi="Wingdings" w:hint="default"/>
+        <w:sz w:val="20"/>
+      </w:rPr>
+    </w:lvl>
+    <w:lvl w:ilvl="8" w:tentative="1">
+      <w:start w:val="1"/>
+      <w:numFmt w:val="bullet"/>
+      <w:lvlText w:val=""/>
+      <w:lvlJc w:val="left"/>
+      <w:pPr>
+        <w:tabs>
+          <w:tab w:val="num" w:pos="6480"/>
+        </w:tabs>
+        <w:ind w:left="6480" w:hanging="360"/>
+      </w:pPr>
+      <w:rPr>
+        <w:rFonts w:ascii="Wingdings" w:hAnsi="Wingdings" w:hint="default"/>
+        <w:sz w:val="20"/>
+      </w:rPr>
+    </w:lvl>
+  </w:abstractNum>
+  <w:abstractNum w:abstractNumId="2" w15:restartNumberingAfterBreak="0">
+    <w:nsid w:val="1A666CCE"/>
+    <w:multiLevelType w:val="multilevel"/>
+    <w:tmpl w:val="B6BA8D44"/>
+    <w:lvl w:ilvl="0">
+      <w:start w:val="1"/>
+      <w:numFmt w:val="bullet"/>
+      <w:lvlText w:val=""/>
+      <w:lvlJc w:val="left"/>
+      <w:pPr>
+        <w:tabs>
+          <w:tab w:val="num" w:pos="720"/>
+        </w:tabs>
+        <w:ind w:left="720" w:hanging="360"/>
+      </w:pPr>
+      <w:rPr>
+        <w:rFonts w:ascii="Symbol" w:hAnsi="Symbol" w:hint="default"/>
+        <w:sz w:val="20"/>
+      </w:rPr>
+    </w:lvl>
+    <w:lvl w:ilvl="1" w:tentative="1">
+      <w:start w:val="1"/>
+      <w:numFmt w:val="bullet"/>
+      <w:lvlText w:val="o"/>
+      <w:lvlJc w:val="left"/>
+      <w:pPr>
+        <w:tabs>
+          <w:tab w:val="num" w:pos="1440"/>
+        </w:tabs>
+        <w:ind w:left="1440" w:hanging="360"/>
+      </w:pPr>
+      <w:rPr>
+        <w:rFonts w:ascii="Courier New" w:hAnsi="Courier New" w:hint="default"/>
+        <w:sz w:val="20"/>
+      </w:rPr>
+    </w:lvl>
+    <w:lvl w:ilvl="2" w:tentative="1">
+      <w:start w:val="1"/>
+      <w:numFmt w:val="bullet"/>
+      <w:lvlText w:val=""/>
+      <w:lvlJc w:val="left"/>
+      <w:pPr>
+        <w:tabs>
+          <w:tab w:val="num" w:pos="2160"/>
+        </w:tabs>
+        <w:ind w:left="2160" w:hanging="360"/>
+      </w:pPr>
+      <w:rPr>
+        <w:rFonts w:ascii="Wingdings" w:hAnsi="Wingdings" w:hint="default"/>
+        <w:sz w:val="20"/>
+      </w:rPr>
+    </w:lvl>
+    <w:lvl w:ilvl="3" w:tentative="1">
+      <w:start w:val="1"/>
+      <w:numFmt w:val="bullet"/>
+      <w:lvlText w:val=""/>
+      <w:lvlJc w:val="left"/>
+      <w:pPr>
+        <w:tabs>
+          <w:tab w:val="num" w:pos="2880"/>
+        </w:tabs>
+        <w:ind w:left="2880" w:hanging="360"/>
+      </w:pPr>
+      <w:rPr>
+        <w:rFonts w:ascii="Wingdings" w:hAnsi="Wingdings" w:hint="default"/>
+        <w:sz w:val="20"/>
+      </w:rPr>
+    </w:lvl>
+    <w:lvl w:ilvl="4" w:tentative="1">
+      <w:start w:val="1"/>
+      <w:numFmt w:val="bullet"/>
+      <w:lvlText w:val=""/>
+      <w:lvlJc w:val="left"/>
+      <w:pPr>
+        <w:tabs>
+          <w:tab w:val="num" w:pos="3600"/>
+        </w:tabs>
+        <w:ind w:left="3600" w:hanging="360"/>
+      </w:pPr>
+      <w:rPr>
+        <w:rFonts w:ascii="Wingdings" w:hAnsi="Wingdings" w:hint="default"/>
+        <w:sz w:val="20"/>
+      </w:rPr>
+    </w:lvl>
+    <w:lvl w:ilvl="5" w:tentative="1">
+      <w:start w:val="1"/>
+      <w:numFmt w:val="bullet"/>
+      <w:lvlText w:val=""/>
+      <w:lvlJc w:val="left"/>
+      <w:pPr>
+        <w:tabs>
+          <w:tab w:val="num" w:pos="4320"/>
+        </w:tabs>
+        <w:ind w:left="4320" w:hanging="360"/>
+      </w:pPr>
+      <w:rPr>
+        <w:rFonts w:ascii="Wingdings" w:hAnsi="Wingdings" w:hint="default"/>
+        <w:sz w:val="20"/>
+      </w:rPr>
+    </w:lvl>
+    <w:lvl w:ilvl="6" w:tentative="1">
+      <w:start w:val="1"/>
+      <w:numFmt w:val="bullet"/>
+      <w:lvlText w:val=""/>
+      <w:lvlJc w:val="left"/>
+      <w:pPr>
+        <w:tabs>
+          <w:tab w:val="num" w:pos="5040"/>
+        </w:tabs>
+        <w:ind w:left="5040" w:hanging="360"/>
+      </w:pPr>
+      <w:rPr>
+        <w:rFonts w:ascii="Wingdings" w:hAnsi="Wingdings" w:hint="default"/>
+        <w:sz w:val="20"/>
+      </w:rPr>
+    </w:lvl>
+    <w:lvl w:ilvl="7" w:tentative="1">
+      <w:start w:val="1"/>
+      <w:numFmt w:val="bullet"/>
+      <w:lvlText w:val=""/>
+      <w:lvlJc w:val="left"/>
+      <w:pPr>
+        <w:tabs>
+          <w:tab w:val="num" w:pos="5760"/>
+        </w:tabs>
+        <w:ind w:left="5760" w:hanging="360"/>
+      </w:pPr>
+      <w:rPr>
+        <w:rFonts w:ascii="Wingdings" w:hAnsi="Wingdings" w:hint="default"/>
+        <w:sz w:val="20"/>
+      </w:rPr>
+    </w:lvl>
+    <w:lvl w:ilvl="8" w:tentative="1">
+      <w:start w:val="1"/>
+      <w:numFmt w:val="bullet"/>
+      <w:lvlText w:val=""/>
+      <w:lvlJc w:val="left"/>
+      <w:pPr>
+        <w:tabs>
+          <w:tab w:val="num" w:pos="6480"/>
+        </w:tabs>
+        <w:ind w:left="6480" w:hanging="360"/>
+      </w:pPr>
+      <w:rPr>
+        <w:rFonts w:ascii="Wingdings" w:hAnsi="Wingdings" w:hint="default"/>
+        <w:sz w:val="20"/>
+      </w:rPr>
+    </w:lvl>
+  </w:abstractNum>
+  <w:abstractNum w:abstractNumId="3" w15:restartNumberingAfterBreak="0">
+    <w:nsid w:val="22316006"/>
+    <w:multiLevelType w:val="multilevel"/>
+    <w:tmpl w:val="2B107A2E"/>
+    <w:lvl w:ilvl="0">
+      <w:start w:val="1"/>
+      <w:numFmt w:val="bullet"/>
+      <w:lvlText w:val=""/>
+      <w:lvlJc w:val="left"/>
+      <w:pPr>
+        <w:tabs>
+          <w:tab w:val="num" w:pos="720"/>
+        </w:tabs>
+        <w:ind w:left="720" w:hanging="360"/>
+      </w:pPr>
+      <w:rPr>
+        <w:rFonts w:ascii="Symbol" w:hAnsi="Symbol" w:hint="default"/>
+        <w:sz w:val="20"/>
+      </w:rPr>
+    </w:lvl>
+    <w:lvl w:ilvl="1" w:tentative="1">
+      <w:start w:val="1"/>
+      <w:numFmt w:val="bullet"/>
+      <w:lvlText w:val="o"/>
+      <w:lvlJc w:val="left"/>
+      <w:pPr>
+        <w:tabs>
+          <w:tab w:val="num" w:pos="1440"/>
+        </w:tabs>
+        <w:ind w:left="1440" w:hanging="360"/>
+      </w:pPr>
+      <w:rPr>
+        <w:rFonts w:ascii="Courier New" w:hAnsi="Courier New" w:hint="default"/>
+        <w:sz w:val="20"/>
+      </w:rPr>
+    </w:lvl>
+    <w:lvl w:ilvl="2" w:tentative="1">
+      <w:start w:val="1"/>
+      <w:numFmt w:val="bullet"/>
+      <w:lvlText w:val=""/>
+      <w:lvlJc w:val="left"/>
+      <w:pPr>
+        <w:tabs>
+          <w:tab w:val="num" w:pos="2160"/>
+        </w:tabs>
+        <w:ind w:left="2160" w:hanging="360"/>
+      </w:pPr>
+      <w:rPr>
+        <w:rFonts w:ascii="Wingdings" w:hAnsi="Wingdings" w:hint="default"/>
+        <w:sz w:val="20"/>
+      </w:rPr>
+    </w:lvl>
+    <w:lvl w:ilvl="3" w:tentative="1">
+      <w:start w:val="1"/>
+      <w:numFmt w:val="bullet"/>
+      <w:lvlText w:val=""/>
+      <w:lvlJc w:val="left"/>
+      <w:pPr>
+        <w:tabs>
+          <w:tab w:val="num" w:pos="2880"/>
+        </w:tabs>
+        <w:ind w:left="2880" w:hanging="360"/>
+      </w:pPr>
+      <w:rPr>
+        <w:rFonts w:ascii="Wingdings" w:hAnsi="Wingdings" w:hint="default"/>
+        <w:sz w:val="20"/>
+      </w:rPr>
+    </w:lvl>
+    <w:lvl w:ilvl="4" w:tentative="1">
+      <w:start w:val="1"/>
+      <w:numFmt w:val="bullet"/>
+      <w:lvlText w:val=""/>
+      <w:lvlJc w:val="left"/>
+      <w:pPr>
+        <w:tabs>
+          <w:tab w:val="num" w:pos="3600"/>
+        </w:tabs>
+        <w:ind w:left="3600" w:hanging="360"/>
+      </w:pPr>
+      <w:rPr>
+        <w:rFonts w:ascii="Wingdings" w:hAnsi="Wingdings" w:hint="default"/>
+        <w:sz w:val="20"/>
+      </w:rPr>
+    </w:lvl>
+    <w:lvl w:ilvl="5" w:tentative="1">
+      <w:start w:val="1"/>
+      <w:numFmt w:val="bullet"/>
+      <w:lvlText w:val=""/>
+      <w:lvlJc w:val="left"/>
+      <w:pPr>
+        <w:tabs>
+          <w:tab w:val="num" w:pos="4320"/>
+        </w:tabs>
+        <w:ind w:left="4320" w:hanging="360"/>
+      </w:pPr>
+      <w:rPr>
+        <w:rFonts w:ascii="Wingdings" w:hAnsi="Wingdings" w:hint="default"/>
+        <w:sz w:val="20"/>
+      </w:rPr>
+    </w:lvl>
+    <w:lvl w:ilvl="6" w:tentative="1">
+      <w:start w:val="1"/>
+      <w:numFmt w:val="bullet"/>
+      <w:lvlText w:val=""/>
+      <w:lvlJc w:val="left"/>
+      <w:pPr>
+        <w:tabs>
+          <w:tab w:val="num" w:pos="5040"/>
+        </w:tabs>
+        <w:ind w:left="5040" w:hanging="360"/>
+      </w:pPr>
+      <w:rPr>
+        <w:rFonts w:ascii="Wingdings" w:hAnsi="Wingdings" w:hint="default"/>
+        <w:sz w:val="20"/>
+      </w:rPr>
+    </w:lvl>
+    <w:lvl w:ilvl="7" w:tentative="1">
+      <w:start w:val="1"/>
+      <w:numFmt w:val="bullet"/>
+      <w:lvlText w:val=""/>
+      <w:lvlJc w:val="left"/>
+      <w:pPr>
+        <w:tabs>
+          <w:tab w:val="num" w:pos="5760"/>
+        </w:tabs>
+        <w:ind w:left="5760" w:hanging="360"/>
+      </w:pPr>
+      <w:rPr>
+        <w:rFonts w:ascii="Wingdings" w:hAnsi="Wingdings" w:hint="default"/>
+        <w:sz w:val="20"/>
+      </w:rPr>
+    </w:lvl>
+    <w:lvl w:ilvl="8" w:tentative="1">
+      <w:start w:val="1"/>
+      <w:numFmt w:val="bullet"/>
+      <w:lvlText w:val=""/>
+      <w:lvlJc w:val="left"/>
+      <w:pPr>
+        <w:tabs>
+          <w:tab w:val="num" w:pos="6480"/>
+        </w:tabs>
+        <w:ind w:left="6480" w:hanging="360"/>
+      </w:pPr>
+      <w:rPr>
+        <w:rFonts w:ascii="Wingdings" w:hAnsi="Wingdings" w:hint="default"/>
+        <w:sz w:val="20"/>
+      </w:rPr>
+    </w:lvl>
+  </w:abstractNum>
+  <w:abstractNum w:abstractNumId="4" w15:restartNumberingAfterBreak="0">
+    <w:nsid w:val="24477531"/>
+    <w:multiLevelType w:val="multilevel"/>
+    <w:tmpl w:val="5326537C"/>
+    <w:lvl w:ilvl="0">
+      <w:start w:val="1"/>
+      <w:numFmt w:val="bullet"/>
+      <w:lvlText w:val=""/>
+      <w:lvlJc w:val="left"/>
+      <w:pPr>
+        <w:tabs>
+          <w:tab w:val="num" w:pos="720"/>
+        </w:tabs>
+        <w:ind w:left="720" w:hanging="360"/>
+      </w:pPr>
+      <w:rPr>
+        <w:rFonts w:ascii="Symbol" w:hAnsi="Symbol" w:hint="default"/>
+        <w:sz w:val="20"/>
+      </w:rPr>
+    </w:lvl>
+    <w:lvl w:ilvl="1" w:tentative="1">
+      <w:start w:val="1"/>
+      <w:numFmt w:val="bullet"/>
+      <w:lvlText w:val="o"/>
+      <w:lvlJc w:val="left"/>
+      <w:pPr>
+        <w:tabs>
+          <w:tab w:val="num" w:pos="1440"/>
+        </w:tabs>
+        <w:ind w:left="1440" w:hanging="360"/>
+      </w:pPr>
+      <w:rPr>
+        <w:rFonts w:ascii="Courier New" w:hAnsi="Courier New" w:hint="default"/>
+        <w:sz w:val="20"/>
+      </w:rPr>
+    </w:lvl>
+    <w:lvl w:ilvl="2" w:tentative="1">
+      <w:start w:val="1"/>
+      <w:numFmt w:val="bullet"/>
+      <w:lvlText w:val=""/>
+      <w:lvlJc w:val="left"/>
+      <w:pPr>
+        <w:tabs>
+          <w:tab w:val="num" w:pos="2160"/>
+        </w:tabs>
+        <w:ind w:left="2160" w:hanging="360"/>
+      </w:pPr>
+      <w:rPr>
+        <w:rFonts w:ascii="Wingdings" w:hAnsi="Wingdings" w:hint="default"/>
+        <w:sz w:val="20"/>
+      </w:rPr>
+    </w:lvl>
+    <w:lvl w:ilvl="3" w:tentative="1">
+      <w:start w:val="1"/>
+      <w:numFmt w:val="bullet"/>
+      <w:lvlText w:val=""/>
+      <w:lvlJc w:val="left"/>
+      <w:pPr>
+        <w:tabs>
+          <w:tab w:val="num" w:pos="2880"/>
+        </w:tabs>
+        <w:ind w:left="2880" w:hanging="360"/>
+      </w:pPr>
+      <w:rPr>
+        <w:rFonts w:ascii="Wingdings" w:hAnsi="Wingdings" w:hint="default"/>
+        <w:sz w:val="20"/>
+      </w:rPr>
+    </w:lvl>
+    <w:lvl w:ilvl="4" w:tentative="1">
+      <w:start w:val="1"/>
+      <w:numFmt w:val="bullet"/>
+      <w:lvlText w:val=""/>
+      <w:lvlJc w:val="left"/>
+      <w:pPr>
+        <w:tabs>
+          <w:tab w:val="num" w:pos="3600"/>
+        </w:tabs>
+        <w:ind w:left="3600" w:hanging="360"/>
+      </w:pPr>
+      <w:rPr>
+        <w:rFonts w:ascii="Wingdings" w:hAnsi="Wingdings" w:hint="default"/>
+        <w:sz w:val="20"/>
+      </w:rPr>
+    </w:lvl>
+    <w:lvl w:ilvl="5" w:tentative="1">
+      <w:start w:val="1"/>
+      <w:numFmt w:val="bullet"/>
+      <w:lvlText w:val=""/>
+      <w:lvlJc w:val="left"/>
+      <w:pPr>
+        <w:tabs>
+          <w:tab w:val="num" w:pos="4320"/>
+        </w:tabs>
+        <w:ind w:left="4320" w:hanging="360"/>
+      </w:pPr>
+      <w:rPr>
+        <w:rFonts w:ascii="Wingdings" w:hAnsi="Wingdings" w:hint="default"/>
+        <w:sz w:val="20"/>
+      </w:rPr>
+    </w:lvl>
+    <w:lvl w:ilvl="6" w:tentative="1">
+      <w:start w:val="1"/>
+      <w:numFmt w:val="bullet"/>
+      <w:lvlText w:val=""/>
+      <w:lvlJc w:val="left"/>
+      <w:pPr>
+        <w:tabs>
+          <w:tab w:val="num" w:pos="5040"/>
+        </w:tabs>
+        <w:ind w:left="5040" w:hanging="360"/>
+      </w:pPr>
+      <w:rPr>
+        <w:rFonts w:ascii="Wingdings" w:hAnsi="Wingdings" w:hint="default"/>
+        <w:sz w:val="20"/>
+      </w:rPr>
+    </w:lvl>
+    <w:lvl w:ilvl="7" w:tentative="1">
+      <w:start w:val="1"/>
+      <w:numFmt w:val="bullet"/>
+      <w:lvlText w:val=""/>
+      <w:lvlJc w:val="left"/>
+      <w:pPr>
+        <w:tabs>
+          <w:tab w:val="num" w:pos="5760"/>
+        </w:tabs>
+        <w:ind w:left="5760" w:hanging="360"/>
+      </w:pPr>
+      <w:rPr>
+        <w:rFonts w:ascii="Wingdings" w:hAnsi="Wingdings" w:hint="default"/>
+        <w:sz w:val="20"/>
+      </w:rPr>
+    </w:lvl>
+    <w:lvl w:ilvl="8" w:tentative="1">
+      <w:start w:val="1"/>
+      <w:numFmt w:val="bullet"/>
+      <w:lvlText w:val=""/>
+      <w:lvlJc w:val="left"/>
+      <w:pPr>
+        <w:tabs>
+          <w:tab w:val="num" w:pos="6480"/>
+        </w:tabs>
+        <w:ind w:left="6480" w:hanging="360"/>
+      </w:pPr>
+      <w:rPr>
+        <w:rFonts w:ascii="Wingdings" w:hAnsi="Wingdings" w:hint="default"/>
+        <w:sz w:val="20"/>
+      </w:rPr>
+    </w:lvl>
+  </w:abstractNum>
+  <w:abstractNum w:abstractNumId="5" w15:restartNumberingAfterBreak="0">
+    <w:nsid w:val="2B093D45"/>
+    <w:multiLevelType w:val="multilevel"/>
+    <w:tmpl w:val="89CC01C4"/>
+    <w:lvl w:ilvl="0">
+      <w:start w:val="1"/>
+      <w:numFmt w:val="bullet"/>
+      <w:lvlText w:val=""/>
+      <w:lvlJc w:val="left"/>
+      <w:pPr>
+        <w:tabs>
+          <w:tab w:val="num" w:pos="720"/>
+        </w:tabs>
+        <w:ind w:left="720" w:hanging="360"/>
+      </w:pPr>
+      <w:rPr>
+        <w:rFonts w:ascii="Symbol" w:hAnsi="Symbol" w:hint="default"/>
+        <w:sz w:val="20"/>
+      </w:rPr>
+    </w:lvl>
+    <w:lvl w:ilvl="1" w:tentative="1">
+      <w:start w:val="1"/>
+      <w:numFmt w:val="bullet"/>
+      <w:lvlText w:val="o"/>
+      <w:lvlJc w:val="left"/>
+      <w:pPr>
+        <w:tabs>
+          <w:tab w:val="num" w:pos="1440"/>
+        </w:tabs>
+        <w:ind w:left="1440" w:hanging="360"/>
+      </w:pPr>
+      <w:rPr>
+        <w:rFonts w:ascii="Courier New" w:hAnsi="Courier New" w:hint="default"/>
+        <w:sz w:val="20"/>
+      </w:rPr>
+    </w:lvl>
+    <w:lvl w:ilvl="2" w:tentative="1">
+      <w:start w:val="1"/>
+      <w:numFmt w:val="bullet"/>
+      <w:lvlText w:val=""/>
+      <w:lvlJc w:val="left"/>
+      <w:pPr>
+        <w:tabs>
+          <w:tab w:val="num" w:pos="2160"/>
+        </w:tabs>
+        <w:ind w:left="2160" w:hanging="360"/>
+      </w:pPr>
+      <w:rPr>
+        <w:rFonts w:ascii="Wingdings" w:hAnsi="Wingdings" w:hint="default"/>
+        <w:sz w:val="20"/>
+      </w:rPr>
+    </w:lvl>
+    <w:lvl w:ilvl="3" w:tentative="1">
+      <w:start w:val="1"/>
+      <w:numFmt w:val="bullet"/>
+      <w:lvlText w:val=""/>
+      <w:lvlJc w:val="left"/>
+      <w:pPr>
+        <w:tabs>
+          <w:tab w:val="num" w:pos="2880"/>
+        </w:tabs>
+        <w:ind w:left="2880" w:hanging="360"/>
+      </w:pPr>
+      <w:rPr>
+        <w:rFonts w:ascii="Wingdings" w:hAnsi="Wingdings" w:hint="default"/>
+        <w:sz w:val="20"/>
+      </w:rPr>
+    </w:lvl>
+    <w:lvl w:ilvl="4" w:tentative="1">
+      <w:start w:val="1"/>
+      <w:numFmt w:val="bullet"/>
+      <w:lvlText w:val=""/>
+      <w:lvlJc w:val="left"/>
+      <w:pPr>
+        <w:tabs>
+          <w:tab w:val="num" w:pos="3600"/>
+        </w:tabs>
+        <w:ind w:left="3600" w:hanging="360"/>
+      </w:pPr>
+      <w:rPr>
+        <w:rFonts w:ascii="Wingdings" w:hAnsi="Wingdings" w:hint="default"/>
+        <w:sz w:val="20"/>
+      </w:rPr>
+    </w:lvl>
+    <w:lvl w:ilvl="5" w:tentative="1">
+      <w:start w:val="1"/>
+      <w:numFmt w:val="bullet"/>
+      <w:lvlText w:val=""/>
+      <w:lvlJc w:val="left"/>
+      <w:pPr>
+        <w:tabs>
+          <w:tab w:val="num" w:pos="4320"/>
+        </w:tabs>
+        <w:ind w:left="4320" w:hanging="360"/>
+      </w:pPr>
+      <w:rPr>
+        <w:rFonts w:ascii="Wingdings" w:hAnsi="Wingdings" w:hint="default"/>
+        <w:sz w:val="20"/>
+      </w:rPr>
+    </w:lvl>
+    <w:lvl w:ilvl="6" w:tentative="1">
+      <w:start w:val="1"/>
+      <w:numFmt w:val="bullet"/>
+      <w:lvlText w:val=""/>
+      <w:lvlJc w:val="left"/>
+      <w:pPr>
+        <w:tabs>
+          <w:tab w:val="num" w:pos="5040"/>
+        </w:tabs>
+        <w:ind w:left="5040" w:hanging="360"/>
+      </w:pPr>
+      <w:rPr>
+        <w:rFonts w:ascii="Wingdings" w:hAnsi="Wingdings" w:hint="default"/>
+        <w:sz w:val="20"/>
+      </w:rPr>
+    </w:lvl>
+    <w:lvl w:ilvl="7" w:tentative="1">
+      <w:start w:val="1"/>
+      <w:numFmt w:val="bullet"/>
+      <w:lvlText w:val=""/>
+      <w:lvlJc w:val="left"/>
+      <w:pPr>
+        <w:tabs>
+          <w:tab w:val="num" w:pos="5760"/>
+        </w:tabs>
+        <w:ind w:left="5760" w:hanging="360"/>
+      </w:pPr>
+      <w:rPr>
+        <w:rFonts w:ascii="Wingdings" w:hAnsi="Wingdings" w:hint="default"/>
+        <w:sz w:val="20"/>
+      </w:rPr>
+    </w:lvl>
+    <w:lvl w:ilvl="8" w:tentative="1">
+      <w:start w:val="1"/>
+      <w:numFmt w:val="bullet"/>
+      <w:lvlText w:val=""/>
+      <w:lvlJc w:val="left"/>
+      <w:pPr>
+        <w:tabs>
+          <w:tab w:val="num" w:pos="6480"/>
+        </w:tabs>
+        <w:ind w:left="6480" w:hanging="360"/>
+      </w:pPr>
+      <w:rPr>
+        <w:rFonts w:ascii="Wingdings" w:hAnsi="Wingdings" w:hint="default"/>
+        <w:sz w:val="20"/>
+      </w:rPr>
+    </w:lvl>
+  </w:abstractNum>
+  <w:abstractNum w:abstractNumId="6" w15:restartNumberingAfterBreak="0">
+    <w:nsid w:val="2F2551C7"/>
+    <w:multiLevelType w:val="multilevel"/>
+    <w:tmpl w:val="EF123184"/>
+    <w:lvl w:ilvl="0">
+      <w:start w:val="1"/>
+      <w:numFmt w:val="bullet"/>
+      <w:lvlText w:val=""/>
+      <w:lvlJc w:val="left"/>
+      <w:pPr>
+        <w:tabs>
+          <w:tab w:val="num" w:pos="720"/>
+        </w:tabs>
+        <w:ind w:left="720" w:hanging="360"/>
+      </w:pPr>
+      <w:rPr>
+        <w:rFonts w:ascii="Symbol" w:hAnsi="Symbol" w:hint="default"/>
+        <w:sz w:val="20"/>
+      </w:rPr>
+    </w:lvl>
+    <w:lvl w:ilvl="1" w:tentative="1">
+      <w:start w:val="1"/>
+      <w:numFmt w:val="bullet"/>
+      <w:lvlText w:val="o"/>
+      <w:lvlJc w:val="left"/>
+      <w:pPr>
+        <w:tabs>
+          <w:tab w:val="num" w:pos="1440"/>
+        </w:tabs>
+        <w:ind w:left="1440" w:hanging="360"/>
+      </w:pPr>
+      <w:rPr>
+        <w:rFonts w:ascii="Courier New" w:hAnsi="Courier New" w:hint="default"/>
+        <w:sz w:val="20"/>
+      </w:rPr>
+    </w:lvl>
+    <w:lvl w:ilvl="2" w:tentative="1">
+      <w:start w:val="1"/>
+      <w:numFmt w:val="bullet"/>
+      <w:lvlText w:val=""/>
+      <w:lvlJc w:val="left"/>
+      <w:pPr>
+        <w:tabs>
+          <w:tab w:val="num" w:pos="2160"/>
+        </w:tabs>
+        <w:ind w:left="2160" w:hanging="360"/>
+      </w:pPr>
+      <w:rPr>
+        <w:rFonts w:ascii="Wingdings" w:hAnsi="Wingdings" w:hint="default"/>
+        <w:sz w:val="20"/>
+      </w:rPr>
+    </w:lvl>
+    <w:lvl w:ilvl="3" w:tentative="1">
+      <w:start w:val="1"/>
+      <w:numFmt w:val="bullet"/>
+      <w:lvlText w:val=""/>
+      <w:lvlJc w:val="left"/>
+      <w:pPr>
+        <w:tabs>
+          <w:tab w:val="num" w:pos="2880"/>
+        </w:tabs>
+        <w:ind w:left="2880" w:hanging="360"/>
+      </w:pPr>
+      <w:rPr>
+        <w:rFonts w:ascii="Wingdings" w:hAnsi="Wingdings" w:hint="default"/>
+        <w:sz w:val="20"/>
+      </w:rPr>
+    </w:lvl>
+    <w:lvl w:ilvl="4" w:tentative="1">
+      <w:start w:val="1"/>
+      <w:numFmt w:val="bullet"/>
+      <w:lvlText w:val=""/>
+      <w:lvlJc w:val="left"/>
+      <w:pPr>
+        <w:tabs>
+          <w:tab w:val="num" w:pos="3600"/>
+        </w:tabs>
+        <w:ind w:left="3600" w:hanging="360"/>
+      </w:pPr>
+      <w:rPr>
+        <w:rFonts w:ascii="Wingdings" w:hAnsi="Wingdings" w:hint="default"/>
+        <w:sz w:val="20"/>
+      </w:rPr>
+    </w:lvl>
+    <w:lvl w:ilvl="5" w:tentative="1">
+      <w:start w:val="1"/>
+      <w:numFmt w:val="bullet"/>
+      <w:lvlText w:val=""/>
+      <w:lvlJc w:val="left"/>
+      <w:pPr>
+        <w:tabs>
+          <w:tab w:val="num" w:pos="4320"/>
+        </w:tabs>
+        <w:ind w:left="4320" w:hanging="360"/>
+      </w:pPr>
+      <w:rPr>
+        <w:rFonts w:ascii="Wingdings" w:hAnsi="Wingdings" w:hint="default"/>
+        <w:sz w:val="20"/>
+      </w:rPr>
+    </w:lvl>
+    <w:lvl w:ilvl="6" w:tentative="1">
+      <w:start w:val="1"/>
+      <w:numFmt w:val="bullet"/>
+      <w:lvlText w:val=""/>
+      <w:lvlJc w:val="left"/>
+      <w:pPr>
+        <w:tabs>
+          <w:tab w:val="num" w:pos="5040"/>
+        </w:tabs>
+        <w:ind w:left="5040" w:hanging="360"/>
+      </w:pPr>
+      <w:rPr>
+        <w:rFonts w:ascii="Wingdings" w:hAnsi="Wingdings" w:hint="default"/>
+        <w:sz w:val="20"/>
+      </w:rPr>
+    </w:lvl>
+    <w:lvl w:ilvl="7" w:tentative="1">
+      <w:start w:val="1"/>
+      <w:numFmt w:val="bullet"/>
+      <w:lvlText w:val=""/>
+      <w:lvlJc w:val="left"/>
+      <w:pPr>
+        <w:tabs>
+          <w:tab w:val="num" w:pos="5760"/>
+        </w:tabs>
+        <w:ind w:left="5760" w:hanging="360"/>
+      </w:pPr>
+      <w:rPr>
+        <w:rFonts w:ascii="Wingdings" w:hAnsi="Wingdings" w:hint="default"/>
+        <w:sz w:val="20"/>
+      </w:rPr>
+    </w:lvl>
+    <w:lvl w:ilvl="8" w:tentative="1">
+      <w:start w:val="1"/>
+      <w:numFmt w:val="bullet"/>
+      <w:lvlText w:val=""/>
+      <w:lvlJc w:val="left"/>
+      <w:pPr>
+        <w:tabs>
+          <w:tab w:val="num" w:pos="6480"/>
+        </w:tabs>
+        <w:ind w:left="6480" w:hanging="360"/>
+      </w:pPr>
+      <w:rPr>
+        <w:rFonts w:ascii="Wingdings" w:hAnsi="Wingdings" w:hint="default"/>
+        <w:sz w:val="20"/>
+      </w:rPr>
+    </w:lvl>
+  </w:abstractNum>
+  <w:abstractNum w:abstractNumId="7" w15:restartNumberingAfterBreak="0">
+    <w:nsid w:val="308B037B"/>
+    <w:multiLevelType w:val="multilevel"/>
+    <w:tmpl w:val="45CC22D2"/>
+    <w:lvl w:ilvl="0">
+      <w:start w:val="1"/>
+      <w:numFmt w:val="bullet"/>
+      <w:lvlText w:val=""/>
+      <w:lvlJc w:val="left"/>
+      <w:pPr>
+        <w:tabs>
+          <w:tab w:val="num" w:pos="720"/>
+        </w:tabs>
+        <w:ind w:left="720" w:hanging="360"/>
+      </w:pPr>
+      <w:rPr>
+        <w:rFonts w:ascii="Symbol" w:hAnsi="Symbol" w:hint="default"/>
+        <w:sz w:val="20"/>
+      </w:rPr>
+    </w:lvl>
+    <w:lvl w:ilvl="1" w:tentative="1">
+      <w:start w:val="1"/>
+      <w:numFmt w:val="bullet"/>
+      <w:lvlText w:val="o"/>
+      <w:lvlJc w:val="left"/>
+      <w:pPr>
+        <w:tabs>
+          <w:tab w:val="num" w:pos="1440"/>
+        </w:tabs>
+        <w:ind w:left="1440" w:hanging="360"/>
+      </w:pPr>
+      <w:rPr>
+        <w:rFonts w:ascii="Courier New" w:hAnsi="Courier New" w:hint="default"/>
+        <w:sz w:val="20"/>
+      </w:rPr>
+    </w:lvl>
+    <w:lvl w:ilvl="2" w:tentative="1">
+      <w:start w:val="1"/>
+      <w:numFmt w:val="bullet"/>
+      <w:lvlText w:val=""/>
+      <w:lvlJc w:val="left"/>
+      <w:pPr>
+        <w:tabs>
+          <w:tab w:val="num" w:pos="2160"/>
+        </w:tabs>
+        <w:ind w:left="2160" w:hanging="360"/>
+      </w:pPr>
+      <w:rPr>
+        <w:rFonts w:ascii="Wingdings" w:hAnsi="Wingdings" w:hint="default"/>
+        <w:sz w:val="20"/>
+      </w:rPr>
+    </w:lvl>
+    <w:lvl w:ilvl="3" w:tentative="1">
+      <w:start w:val="1"/>
+      <w:numFmt w:val="bullet"/>
+      <w:lvlText w:val=""/>
+      <w:lvlJc w:val="left"/>
+      <w:pPr>
+        <w:tabs>
+          <w:tab w:val="num" w:pos="2880"/>
+        </w:tabs>
+        <w:ind w:left="2880" w:hanging="360"/>
+      </w:pPr>
+      <w:rPr>
+        <w:rFonts w:ascii="Wingdings" w:hAnsi="Wingdings" w:hint="default"/>
+        <w:sz w:val="20"/>
+      </w:rPr>
+    </w:lvl>
+    <w:lvl w:ilvl="4" w:tentative="1">
+      <w:start w:val="1"/>
+      <w:numFmt w:val="bullet"/>
+      <w:lvlText w:val=""/>
+      <w:lvlJc w:val="left"/>
+      <w:pPr>
+        <w:tabs>
+          <w:tab w:val="num" w:pos="3600"/>
+        </w:tabs>
+        <w:ind w:left="3600" w:hanging="360"/>
+      </w:pPr>
+      <w:rPr>
+        <w:rFonts w:ascii="Wingdings" w:hAnsi="Wingdings" w:hint="default"/>
+        <w:sz w:val="20"/>
+      </w:rPr>
+    </w:lvl>
+    <w:lvl w:ilvl="5" w:tentative="1">
+      <w:start w:val="1"/>
+      <w:numFmt w:val="bullet"/>
+      <w:lvlText w:val=""/>
+      <w:lvlJc w:val="left"/>
+      <w:pPr>
+        <w:tabs>
+          <w:tab w:val="num" w:pos="4320"/>
+        </w:tabs>
+        <w:ind w:left="4320" w:hanging="360"/>
+      </w:pPr>
+      <w:rPr>
+        <w:rFonts w:ascii="Wingdings" w:hAnsi="Wingdings" w:hint="default"/>
+        <w:sz w:val="20"/>
+      </w:rPr>
+    </w:lvl>
+    <w:lvl w:ilvl="6" w:tentative="1">
+      <w:start w:val="1"/>
+      <w:numFmt w:val="bullet"/>
+      <w:lvlText w:val=""/>
+      <w:lvlJc w:val="left"/>
+      <w:pPr>
+        <w:tabs>
+          <w:tab w:val="num" w:pos="5040"/>
+        </w:tabs>
+        <w:ind w:left="5040" w:hanging="360"/>
+      </w:pPr>
+      <w:rPr>
+        <w:rFonts w:ascii="Wingdings" w:hAnsi="Wingdings" w:hint="default"/>
+        <w:sz w:val="20"/>
+      </w:rPr>
+    </w:lvl>
+    <w:lvl w:ilvl="7" w:tentative="1">
+      <w:start w:val="1"/>
+      <w:numFmt w:val="bullet"/>
+      <w:lvlText w:val=""/>
+      <w:lvlJc w:val="left"/>
+      <w:pPr>
+        <w:tabs>
+          <w:tab w:val="num" w:pos="5760"/>
+        </w:tabs>
+        <w:ind w:left="5760" w:hanging="360"/>
+      </w:pPr>
+      <w:rPr>
+        <w:rFonts w:ascii="Wingdings" w:hAnsi="Wingdings" w:hint="default"/>
+        <w:sz w:val="20"/>
+      </w:rPr>
+    </w:lvl>
+    <w:lvl w:ilvl="8" w:tentative="1">
+      <w:start w:val="1"/>
+      <w:numFmt w:val="bullet"/>
+      <w:lvlText w:val=""/>
+      <w:lvlJc w:val="left"/>
+      <w:pPr>
+        <w:tabs>
+          <w:tab w:val="num" w:pos="6480"/>
+        </w:tabs>
+        <w:ind w:left="6480" w:hanging="360"/>
+      </w:pPr>
+      <w:rPr>
+        <w:rFonts w:ascii="Wingdings" w:hAnsi="Wingdings" w:hint="default"/>
+        <w:sz w:val="20"/>
+      </w:rPr>
+    </w:lvl>
+  </w:abstractNum>
+  <w:abstractNum w:abstractNumId="8" w15:restartNumberingAfterBreak="0">
     <w:nsid w:val="31536FF8"/>
     <w:multiLevelType w:val="hybridMultilevel"/>
     <w:tmpl w:val="BB1213E4"/>
@@ -403,8 +2599,488 @@
       </w:rPr>
     </w:lvl>
   </w:abstractNum>
+  <w:abstractNum w:abstractNumId="9" w15:restartNumberingAfterBreak="0">
+    <w:nsid w:val="3CA0189A"/>
+    <w:multiLevelType w:val="multilevel"/>
+    <w:tmpl w:val="00A8A276"/>
+    <w:lvl w:ilvl="0">
+      <w:start w:val="1"/>
+      <w:numFmt w:val="bullet"/>
+      <w:lvlText w:val=""/>
+      <w:lvlJc w:val="left"/>
+      <w:pPr>
+        <w:tabs>
+          <w:tab w:val="num" w:pos="720"/>
+        </w:tabs>
+        <w:ind w:left="720" w:hanging="360"/>
+      </w:pPr>
+      <w:rPr>
+        <w:rFonts w:ascii="Symbol" w:hAnsi="Symbol" w:hint="default"/>
+        <w:sz w:val="20"/>
+      </w:rPr>
+    </w:lvl>
+    <w:lvl w:ilvl="1" w:tentative="1">
+      <w:start w:val="1"/>
+      <w:numFmt w:val="bullet"/>
+      <w:lvlText w:val="o"/>
+      <w:lvlJc w:val="left"/>
+      <w:pPr>
+        <w:tabs>
+          <w:tab w:val="num" w:pos="1440"/>
+        </w:tabs>
+        <w:ind w:left="1440" w:hanging="360"/>
+      </w:pPr>
+      <w:rPr>
+        <w:rFonts w:ascii="Courier New" w:hAnsi="Courier New" w:hint="default"/>
+        <w:sz w:val="20"/>
+      </w:rPr>
+    </w:lvl>
+    <w:lvl w:ilvl="2" w:tentative="1">
+      <w:start w:val="1"/>
+      <w:numFmt w:val="bullet"/>
+      <w:lvlText w:val=""/>
+      <w:lvlJc w:val="left"/>
+      <w:pPr>
+        <w:tabs>
+          <w:tab w:val="num" w:pos="2160"/>
+        </w:tabs>
+        <w:ind w:left="2160" w:hanging="360"/>
+      </w:pPr>
+      <w:rPr>
+        <w:rFonts w:ascii="Wingdings" w:hAnsi="Wingdings" w:hint="default"/>
+        <w:sz w:val="20"/>
+      </w:rPr>
+    </w:lvl>
+    <w:lvl w:ilvl="3" w:tentative="1">
+      <w:start w:val="1"/>
+      <w:numFmt w:val="bullet"/>
+      <w:lvlText w:val=""/>
+      <w:lvlJc w:val="left"/>
+      <w:pPr>
+        <w:tabs>
+          <w:tab w:val="num" w:pos="2880"/>
+        </w:tabs>
+        <w:ind w:left="2880" w:hanging="360"/>
+      </w:pPr>
+      <w:rPr>
+        <w:rFonts w:ascii="Wingdings" w:hAnsi="Wingdings" w:hint="default"/>
+        <w:sz w:val="20"/>
+      </w:rPr>
+    </w:lvl>
+    <w:lvl w:ilvl="4" w:tentative="1">
+      <w:start w:val="1"/>
+      <w:numFmt w:val="bullet"/>
+      <w:lvlText w:val=""/>
+      <w:lvlJc w:val="left"/>
+      <w:pPr>
+        <w:tabs>
+          <w:tab w:val="num" w:pos="3600"/>
+        </w:tabs>
+        <w:ind w:left="3600" w:hanging="360"/>
+      </w:pPr>
+      <w:rPr>
+        <w:rFonts w:ascii="Wingdings" w:hAnsi="Wingdings" w:hint="default"/>
+        <w:sz w:val="20"/>
+      </w:rPr>
+    </w:lvl>
+    <w:lvl w:ilvl="5" w:tentative="1">
+      <w:start w:val="1"/>
+      <w:numFmt w:val="bullet"/>
+      <w:lvlText w:val=""/>
+      <w:lvlJc w:val="left"/>
+      <w:pPr>
+        <w:tabs>
+          <w:tab w:val="num" w:pos="4320"/>
+        </w:tabs>
+        <w:ind w:left="4320" w:hanging="360"/>
+      </w:pPr>
+      <w:rPr>
+        <w:rFonts w:ascii="Wingdings" w:hAnsi="Wingdings" w:hint="default"/>
+        <w:sz w:val="20"/>
+      </w:rPr>
+    </w:lvl>
+    <w:lvl w:ilvl="6" w:tentative="1">
+      <w:start w:val="1"/>
+      <w:numFmt w:val="bullet"/>
+      <w:lvlText w:val=""/>
+      <w:lvlJc w:val="left"/>
+      <w:pPr>
+        <w:tabs>
+          <w:tab w:val="num" w:pos="5040"/>
+        </w:tabs>
+        <w:ind w:left="5040" w:hanging="360"/>
+      </w:pPr>
+      <w:rPr>
+        <w:rFonts w:ascii="Wingdings" w:hAnsi="Wingdings" w:hint="default"/>
+        <w:sz w:val="20"/>
+      </w:rPr>
+    </w:lvl>
+    <w:lvl w:ilvl="7" w:tentative="1">
+      <w:start w:val="1"/>
+      <w:numFmt w:val="bullet"/>
+      <w:lvlText w:val=""/>
+      <w:lvlJc w:val="left"/>
+      <w:pPr>
+        <w:tabs>
+          <w:tab w:val="num" w:pos="5760"/>
+        </w:tabs>
+        <w:ind w:left="5760" w:hanging="360"/>
+      </w:pPr>
+      <w:rPr>
+        <w:rFonts w:ascii="Wingdings" w:hAnsi="Wingdings" w:hint="default"/>
+        <w:sz w:val="20"/>
+      </w:rPr>
+    </w:lvl>
+    <w:lvl w:ilvl="8" w:tentative="1">
+      <w:start w:val="1"/>
+      <w:numFmt w:val="bullet"/>
+      <w:lvlText w:val=""/>
+      <w:lvlJc w:val="left"/>
+      <w:pPr>
+        <w:tabs>
+          <w:tab w:val="num" w:pos="6480"/>
+        </w:tabs>
+        <w:ind w:left="6480" w:hanging="360"/>
+      </w:pPr>
+      <w:rPr>
+        <w:rFonts w:ascii="Wingdings" w:hAnsi="Wingdings" w:hint="default"/>
+        <w:sz w:val="20"/>
+      </w:rPr>
+    </w:lvl>
+  </w:abstractNum>
+  <w:abstractNum w:abstractNumId="10" w15:restartNumberingAfterBreak="0">
+    <w:nsid w:val="5A6C2AD8"/>
+    <w:multiLevelType w:val="multilevel"/>
+    <w:tmpl w:val="C07E16F4"/>
+    <w:lvl w:ilvl="0">
+      <w:start w:val="1"/>
+      <w:numFmt w:val="bullet"/>
+      <w:lvlText w:val=""/>
+      <w:lvlJc w:val="left"/>
+      <w:pPr>
+        <w:tabs>
+          <w:tab w:val="num" w:pos="720"/>
+        </w:tabs>
+        <w:ind w:left="720" w:hanging="360"/>
+      </w:pPr>
+      <w:rPr>
+        <w:rFonts w:ascii="Symbol" w:hAnsi="Symbol" w:hint="default"/>
+        <w:sz w:val="20"/>
+      </w:rPr>
+    </w:lvl>
+    <w:lvl w:ilvl="1" w:tentative="1">
+      <w:start w:val="1"/>
+      <w:numFmt w:val="bullet"/>
+      <w:lvlText w:val="o"/>
+      <w:lvlJc w:val="left"/>
+      <w:pPr>
+        <w:tabs>
+          <w:tab w:val="num" w:pos="1440"/>
+        </w:tabs>
+        <w:ind w:left="1440" w:hanging="360"/>
+      </w:pPr>
+      <w:rPr>
+        <w:rFonts w:ascii="Courier New" w:hAnsi="Courier New" w:hint="default"/>
+        <w:sz w:val="20"/>
+      </w:rPr>
+    </w:lvl>
+    <w:lvl w:ilvl="2" w:tentative="1">
+      <w:start w:val="1"/>
+      <w:numFmt w:val="bullet"/>
+      <w:lvlText w:val=""/>
+      <w:lvlJc w:val="left"/>
+      <w:pPr>
+        <w:tabs>
+          <w:tab w:val="num" w:pos="2160"/>
+        </w:tabs>
+        <w:ind w:left="2160" w:hanging="360"/>
+      </w:pPr>
+      <w:rPr>
+        <w:rFonts w:ascii="Wingdings" w:hAnsi="Wingdings" w:hint="default"/>
+        <w:sz w:val="20"/>
+      </w:rPr>
+    </w:lvl>
+    <w:lvl w:ilvl="3" w:tentative="1">
+      <w:start w:val="1"/>
+      <w:numFmt w:val="bullet"/>
+      <w:lvlText w:val=""/>
+      <w:lvlJc w:val="left"/>
+      <w:pPr>
+        <w:tabs>
+          <w:tab w:val="num" w:pos="2880"/>
+        </w:tabs>
+        <w:ind w:left="2880" w:hanging="360"/>
+      </w:pPr>
+      <w:rPr>
+        <w:rFonts w:ascii="Wingdings" w:hAnsi="Wingdings" w:hint="default"/>
+        <w:sz w:val="20"/>
+      </w:rPr>
+    </w:lvl>
+    <w:lvl w:ilvl="4" w:tentative="1">
+      <w:start w:val="1"/>
+      <w:numFmt w:val="bullet"/>
+      <w:lvlText w:val=""/>
+      <w:lvlJc w:val="left"/>
+      <w:pPr>
+        <w:tabs>
+          <w:tab w:val="num" w:pos="3600"/>
+        </w:tabs>
+        <w:ind w:left="3600" w:hanging="360"/>
+      </w:pPr>
+      <w:rPr>
+        <w:rFonts w:ascii="Wingdings" w:hAnsi="Wingdings" w:hint="default"/>
+        <w:sz w:val="20"/>
+      </w:rPr>
+    </w:lvl>
+    <w:lvl w:ilvl="5" w:tentative="1">
+      <w:start w:val="1"/>
+      <w:numFmt w:val="bullet"/>
+      <w:lvlText w:val=""/>
+      <w:lvlJc w:val="left"/>
+      <w:pPr>
+        <w:tabs>
+          <w:tab w:val="num" w:pos="4320"/>
+        </w:tabs>
+        <w:ind w:left="4320" w:hanging="360"/>
+      </w:pPr>
+      <w:rPr>
+        <w:rFonts w:ascii="Wingdings" w:hAnsi="Wingdings" w:hint="default"/>
+        <w:sz w:val="20"/>
+      </w:rPr>
+    </w:lvl>
+    <w:lvl w:ilvl="6" w:tentative="1">
+      <w:start w:val="1"/>
+      <w:numFmt w:val="bullet"/>
+      <w:lvlText w:val=""/>
+      <w:lvlJc w:val="left"/>
+      <w:pPr>
+        <w:tabs>
+          <w:tab w:val="num" w:pos="5040"/>
+        </w:tabs>
+        <w:ind w:left="5040" w:hanging="360"/>
+      </w:pPr>
+      <w:rPr>
+        <w:rFonts w:ascii="Wingdings" w:hAnsi="Wingdings" w:hint="default"/>
+        <w:sz w:val="20"/>
+      </w:rPr>
+    </w:lvl>
+    <w:lvl w:ilvl="7" w:tentative="1">
+      <w:start w:val="1"/>
+      <w:numFmt w:val="bullet"/>
+      <w:lvlText w:val=""/>
+      <w:lvlJc w:val="left"/>
+      <w:pPr>
+        <w:tabs>
+          <w:tab w:val="num" w:pos="5760"/>
+        </w:tabs>
+        <w:ind w:left="5760" w:hanging="360"/>
+      </w:pPr>
+      <w:rPr>
+        <w:rFonts w:ascii="Wingdings" w:hAnsi="Wingdings" w:hint="default"/>
+        <w:sz w:val="20"/>
+      </w:rPr>
+    </w:lvl>
+    <w:lvl w:ilvl="8" w:tentative="1">
+      <w:start w:val="1"/>
+      <w:numFmt w:val="bullet"/>
+      <w:lvlText w:val=""/>
+      <w:lvlJc w:val="left"/>
+      <w:pPr>
+        <w:tabs>
+          <w:tab w:val="num" w:pos="6480"/>
+        </w:tabs>
+        <w:ind w:left="6480" w:hanging="360"/>
+      </w:pPr>
+      <w:rPr>
+        <w:rFonts w:ascii="Wingdings" w:hAnsi="Wingdings" w:hint="default"/>
+        <w:sz w:val="20"/>
+      </w:rPr>
+    </w:lvl>
+  </w:abstractNum>
+  <w:abstractNum w:abstractNumId="11" w15:restartNumberingAfterBreak="0">
+    <w:nsid w:val="6A6318BE"/>
+    <w:multiLevelType w:val="multilevel"/>
+    <w:tmpl w:val="C9A07F06"/>
+    <w:lvl w:ilvl="0">
+      <w:start w:val="1"/>
+      <w:numFmt w:val="bullet"/>
+      <w:lvlText w:val=""/>
+      <w:lvlJc w:val="left"/>
+      <w:pPr>
+        <w:tabs>
+          <w:tab w:val="num" w:pos="720"/>
+        </w:tabs>
+        <w:ind w:left="720" w:hanging="360"/>
+      </w:pPr>
+      <w:rPr>
+        <w:rFonts w:ascii="Symbol" w:hAnsi="Symbol" w:hint="default"/>
+        <w:sz w:val="20"/>
+      </w:rPr>
+    </w:lvl>
+    <w:lvl w:ilvl="1" w:tentative="1">
+      <w:start w:val="1"/>
+      <w:numFmt w:val="bullet"/>
+      <w:lvlText w:val="o"/>
+      <w:lvlJc w:val="left"/>
+      <w:pPr>
+        <w:tabs>
+          <w:tab w:val="num" w:pos="1440"/>
+        </w:tabs>
+        <w:ind w:left="1440" w:hanging="360"/>
+      </w:pPr>
+      <w:rPr>
+        <w:rFonts w:ascii="Courier New" w:hAnsi="Courier New" w:hint="default"/>
+        <w:sz w:val="20"/>
+      </w:rPr>
+    </w:lvl>
+    <w:lvl w:ilvl="2" w:tentative="1">
+      <w:start w:val="1"/>
+      <w:numFmt w:val="bullet"/>
+      <w:lvlText w:val=""/>
+      <w:lvlJc w:val="left"/>
+      <w:pPr>
+        <w:tabs>
+          <w:tab w:val="num" w:pos="2160"/>
+        </w:tabs>
+        <w:ind w:left="2160" w:hanging="360"/>
+      </w:pPr>
+      <w:rPr>
+        <w:rFonts w:ascii="Wingdings" w:hAnsi="Wingdings" w:hint="default"/>
+        <w:sz w:val="20"/>
+      </w:rPr>
+    </w:lvl>
+    <w:lvl w:ilvl="3" w:tentative="1">
+      <w:start w:val="1"/>
+      <w:numFmt w:val="bullet"/>
+      <w:lvlText w:val=""/>
+      <w:lvlJc w:val="left"/>
+      <w:pPr>
+        <w:tabs>
+          <w:tab w:val="num" w:pos="2880"/>
+        </w:tabs>
+        <w:ind w:left="2880" w:hanging="360"/>
+      </w:pPr>
+      <w:rPr>
+        <w:rFonts w:ascii="Wingdings" w:hAnsi="Wingdings" w:hint="default"/>
+        <w:sz w:val="20"/>
+      </w:rPr>
+    </w:lvl>
+    <w:lvl w:ilvl="4" w:tentative="1">
+      <w:start w:val="1"/>
+      <w:numFmt w:val="bullet"/>
+      <w:lvlText w:val=""/>
+      <w:lvlJc w:val="left"/>
+      <w:pPr>
+        <w:tabs>
+          <w:tab w:val="num" w:pos="3600"/>
+        </w:tabs>
+        <w:ind w:left="3600" w:hanging="360"/>
+      </w:pPr>
+      <w:rPr>
+        <w:rFonts w:ascii="Wingdings" w:hAnsi="Wingdings" w:hint="default"/>
+        <w:sz w:val="20"/>
+      </w:rPr>
+    </w:lvl>
+    <w:lvl w:ilvl="5" w:tentative="1">
+      <w:start w:val="1"/>
+      <w:numFmt w:val="bullet"/>
+      <w:lvlText w:val=""/>
+      <w:lvlJc w:val="left"/>
+      <w:pPr>
+        <w:tabs>
+          <w:tab w:val="num" w:pos="4320"/>
+        </w:tabs>
+        <w:ind w:left="4320" w:hanging="360"/>
+      </w:pPr>
+      <w:rPr>
+        <w:rFonts w:ascii="Wingdings" w:hAnsi="Wingdings" w:hint="default"/>
+        <w:sz w:val="20"/>
+      </w:rPr>
+    </w:lvl>
+    <w:lvl w:ilvl="6" w:tentative="1">
+      <w:start w:val="1"/>
+      <w:numFmt w:val="bullet"/>
+      <w:lvlText w:val=""/>
+      <w:lvlJc w:val="left"/>
+      <w:pPr>
+        <w:tabs>
+          <w:tab w:val="num" w:pos="5040"/>
+        </w:tabs>
+        <w:ind w:left="5040" w:hanging="360"/>
+      </w:pPr>
+      <w:rPr>
+        <w:rFonts w:ascii="Wingdings" w:hAnsi="Wingdings" w:hint="default"/>
+        <w:sz w:val="20"/>
+      </w:rPr>
+    </w:lvl>
+    <w:lvl w:ilvl="7" w:tentative="1">
+      <w:start w:val="1"/>
+      <w:numFmt w:val="bullet"/>
+      <w:lvlText w:val=""/>
+      <w:lvlJc w:val="left"/>
+      <w:pPr>
+        <w:tabs>
+          <w:tab w:val="num" w:pos="5760"/>
+        </w:tabs>
+        <w:ind w:left="5760" w:hanging="360"/>
+      </w:pPr>
+      <w:rPr>
+        <w:rFonts w:ascii="Wingdings" w:hAnsi="Wingdings" w:hint="default"/>
+        <w:sz w:val="20"/>
+      </w:rPr>
+    </w:lvl>
+    <w:lvl w:ilvl="8" w:tentative="1">
+      <w:start w:val="1"/>
+      <w:numFmt w:val="bullet"/>
+      <w:lvlText w:val=""/>
+      <w:lvlJc w:val="left"/>
+      <w:pPr>
+        <w:tabs>
+          <w:tab w:val="num" w:pos="6480"/>
+        </w:tabs>
+        <w:ind w:left="6480" w:hanging="360"/>
+      </w:pPr>
+      <w:rPr>
+        <w:rFonts w:ascii="Wingdings" w:hAnsi="Wingdings" w:hint="default"/>
+        <w:sz w:val="20"/>
+      </w:rPr>
+    </w:lvl>
+  </w:abstractNum>
   <w:num w:numId="1" w16cid:durableId="1259362854">
+    <w:abstractNumId w:val="8"/>
+  </w:num>
+  <w:num w:numId="2" w16cid:durableId="182134336">
+    <w:abstractNumId w:val="6"/>
+  </w:num>
+  <w:num w:numId="3" w16cid:durableId="499547402">
+    <w:abstractNumId w:val="4"/>
+  </w:num>
+  <w:num w:numId="4" w16cid:durableId="248318163">
+    <w:abstractNumId w:val="9"/>
+  </w:num>
+  <w:num w:numId="5" w16cid:durableId="763647138">
     <w:abstractNumId w:val="0"/>
+  </w:num>
+  <w:num w:numId="6" w16cid:durableId="1693603283">
+    <w:abstractNumId w:val="3"/>
+  </w:num>
+  <w:num w:numId="7" w16cid:durableId="153423680">
+    <w:abstractNumId w:val="10"/>
+  </w:num>
+  <w:num w:numId="8" w16cid:durableId="284118000">
+    <w:abstractNumId w:val="5"/>
+  </w:num>
+  <w:num w:numId="9" w16cid:durableId="1479612561">
+    <w:abstractNumId w:val="11"/>
+  </w:num>
+  <w:num w:numId="10" w16cid:durableId="1834491332">
+    <w:abstractNumId w:val="1"/>
+  </w:num>
+  <w:num w:numId="11" w16cid:durableId="556625317">
+    <w:abstractNumId w:val="7"/>
+  </w:num>
+  <w:num w:numId="12" w16cid:durableId="1999383712">
+    <w:abstractNumId w:val="2"/>
   </w:num>
 </w:numbering>
 </file>
@@ -837,7 +3513,6 @@
     <w:next w:val="Normal"/>
     <w:link w:val="Heading2Char"/>
     <w:uiPriority w:val="9"/>
-    <w:semiHidden/>
     <w:unhideWhenUsed/>
     <w:qFormat/>
     <w:rsid w:val="009A5B63"/>
@@ -1012,7 +3687,6 @@
   <w:style w:type="character" w:default="1" w:styleId="DefaultParagraphFont">
     <w:name w:val="Default Paragraph Font"/>
     <w:uiPriority w:val="1"/>
-    <w:semiHidden/>
     <w:unhideWhenUsed/>
   </w:style>
   <w:style w:type="table" w:default="1" w:styleId="TableNormal">
@@ -1054,7 +3728,6 @@
     <w:basedOn w:val="DefaultParagraphFont"/>
     <w:link w:val="Heading2"/>
     <w:uiPriority w:val="9"/>
-    <w:semiHidden/>
     <w:rsid w:val="009A5B63"/>
     <w:rPr>
       <w:rFonts w:asciiTheme="majorHAnsi" w:eastAsiaTheme="majorEastAsia" w:hAnsiTheme="majorHAnsi" w:cstheme="majorBidi"/>

</xml_diff>